<commit_message>
Add logistic regression to AATD comparison; update report and script
Co-Authored-By: Claude Sonnet 5.5 <noreply@anthropic.com>
Claude-Session: https://claude.ai/code/session_0147qv6WZvFHh5tRnNYyMkq8
</commit_message>
<xml_diff>
--- a/AATD_entrega/Relatorio_AATD.docx
+++ b/AATD_entrega/Relatorio_AATD.docx
@@ -251,7 +251,7 @@
         </w:rPr>
         <w:t>2.5 Avaliação (Evaluation)</w:t>
         <w:tab/>
-        <w:t>19</w:t>
+        <w:t>20</w:t>
       </w:r>
     </w:p>
     <w:p>
@@ -319,7 +319,7 @@
         </w:rPr>
         <w:t>3.3 Importância das variáveis</w:t>
         <w:tab/>
-        <w:t>24</w:t>
+        <w:t>25</w:t>
       </w:r>
     </w:p>
     <w:p>
@@ -336,7 +336,7 @@
         </w:rPr>
         <w:t>3.4 Verificações de robustez</w:t>
         <w:tab/>
-        <w:t>26</w:t>
+        <w:t>27</w:t>
       </w:r>
     </w:p>
     <w:p>
@@ -353,7 +353,7 @@
         </w:rPr>
         <w:t>3.5 Modelo final e submissão</w:t>
         <w:tab/>
-        <w:t>27</w:t>
+        <w:t>28</w:t>
       </w:r>
     </w:p>
     <w:p>
@@ -370,7 +370,7 @@
         </w:rPr>
         <w:t>4. Conclusão</w:t>
         <w:tab/>
-        <w:t>28</w:t>
+        <w:t>29</w:t>
       </w:r>
     </w:p>
     <w:p>
@@ -387,7 +387,7 @@
         </w:rPr>
         <w:t>Referências</w:t>
         <w:tab/>
-        <w:t>28</w:t>
+        <w:t>29</w:t>
       </w:r>
     </w:p>
     <w:p>
@@ -404,7 +404,7 @@
         </w:rPr>
         <w:t>Anexo A – Hiperparâmetros e grelhas de pesquisa</w:t>
         <w:tab/>
-        <w:t>30</w:t>
+        <w:t>31</w:t>
       </w:r>
     </w:p>
     <w:p>
@@ -421,7 +421,7 @@
         </w:rPr>
         <w:t>Anexo B – Estrutura do código e reprodutibilidade</w:t>
         <w:tab/>
-        <w:t>30</w:t>
+        <w:t>31</w:t>
       </w:r>
     </w:p>
     <w:p>
@@ -459,7 +459,7 @@
           <w:b w:val="0"/>
           <w:i w:val="0"/>
         </w:rPr>
-        <w:t xml:space="preserve"> Este trabalho aborda um problema de classificação binária em que se pretende prever se um produto, vendido em diversos estabelecimentos, se encontra com desconto (y = 1) ou sem desconto (y = 0), a partir de 17 variáveis discretas (d) e 9 variáveis contínuas (x). Seguiu-se a metodologia CRISP-DM. A análise exploratória dos 3 676 registos de treino revelou um desequilíbrio moderado de classes (20,6% de produtos com desconto), distribuições assimétricas em várias variáveis contínuas, 49 valores em falta em x9 – todos associados a y = 0 – e 170 registos duplicados com etiqueta consistente. Na preparação dos dados trataram-se os valores em falta (mediana e indicador de ausência), avaliaram-se os valores atípicos, o desequilíbrio (sobreamostragem aleatória, SMOTE, subamostragem e ponderação de classes) e a redundância entre variáveis, e o conjunto de treino foi dividido em treino interno (80%) e validação (20%), com validação cruzada estratificada de 5 folds no treino interno. Foram afinados e comparados nove algoritmos – KNN, árvore de decisão, Naive Bayes, MLP, Random Forest, Bagging, AdaBoost, Gradient Boosting e Extra Trees – através de accuracy, precision, recall e F-measure. Os métodos baseados em conjuntos de árvores foram claramente superiores: obtiveram entre 94,6% e 95,9% de accuracy na validação, contra 88,7% do KNN, 78,9% do MLP e 53,3% do Naive Bayes. O modelo selecionado por validação cruzada (AdaBoost, accuracy de 95,1% em CV) foi reajustado com todos os dados de treino e utilizado para gerar o ficheiro de submissão. As diferenças entre os cinco melhores modelos são, no entanto, inferiores ao erro-padrão das estimativas, pelo que não se pode afirmar que um deles seja superior aos restantes.</w:t>
+        <w:t xml:space="preserve"> Este trabalho aborda um problema de classificação binária em que se pretende prever se um produto, vendido em diversos estabelecimentos, se encontra com desconto (y = 1) ou sem desconto (y = 0), a partir de 17 variáveis discretas (d) e 9 variáveis contínuas (x). Seguiu-se a metodologia CRISP-DM. A análise exploratória dos 3 676 registos de treino revelou um desequilíbrio moderado de classes (20,6% de produtos com desconto), distribuições assimétricas em várias variáveis contínuas, 49 valores em falta em x9 – todos associados a y = 0 – e 170 registos duplicados com etiqueta consistente. Na preparação dos dados trataram-se os valores em falta (mediana e indicador de ausência), avaliaram-se os valores atípicos, o desequilíbrio (sobreamostragem aleatória, SMOTE, subamostragem e ponderação de classes) e a redundância entre variáveis, e o conjunto de treino foi dividido em treino interno (80%) e validação (20%), com validação cruzada estratificada de 5 folds no treino interno. Foram afinados e comparados dez algoritmos – KNN, árvore de decisão, regressão logística, Naive Bayes, MLP, Random Forest, Bagging, AdaBoost, Gradient Boosting e Extra Trees – através de accuracy, precision, recall e F-measure. Os métodos baseados em conjuntos de árvores foram claramente superiores: obtiveram entre 94,6% e 95,9% de accuracy na validação, contra 88,7% do KNN, 80,6% da regressão logística, 78,9% do MLP e 53,3% do Naive Bayes. O modelo selecionado por validação cruzada (AdaBoost, accuracy de 95,1% em CV) foi reajustado com todos os dados de treino e utilizado para gerar o ficheiro de submissão. As diferenças entre os cinco melhores modelos são, no entanto, inferiores ao erro-padrão das estimativas, pelo que não se pode afirmar que um deles seja superior aos restantes.</w:t>
       </w:r>
     </w:p>
     <w:p>
@@ -512,7 +512,7 @@
           <w:b w:val="0"/>
           <w:i w:val="0"/>
         </w:rPr>
-        <w:t xml:space="preserve"> This work addresses a binary classification problem: predicting whether a product sold in several establishments is on sale (y = 1) or not (y = 0), using 17 discrete (d) and 9 continuous (x) variables. The CRISP-DM process was followed. Exploratory analysis of the 3,676 training records showed a moderate class imbalance (20.6% positives), skewed continuous variables, 49 missing values in x9 – all of them with y = 0 – and 170 duplicated records with consistent labels. Data preparation covered missing values (median imputation plus a missingness indicator), outliers, class imbalance (random oversampling, SMOTE, undersampling and class weights) and feature redundancy, and the training data were split into an inner training set (80%) and a hold-out validation set (20%), with stratified 5-fold cross-validation on the former. Nine algorithms – KNN, decision tree, Naive Bayes, MLP, Random Forest, Bagging, AdaBoost, Gradient Boosting and Extra Trees – were tuned and compared using accuracy, precision, recall and F-measure. Tree ensembles clearly outperformed the other families, reaching 94.6%–95.9% validation accuracy versus 88.7% for KNN, 78.9% for the MLP and 53.3% for Naive Bayes. The model selected by cross-validation (AdaBoost, 95.1% CV accuracy) was refitted on the full training set to produce the submission file. Differences among the five best models are smaller than the standard error of the estimates, so no single one can be declared superior.</w:t>
+        <w:t xml:space="preserve"> This work addresses a binary classification problem: predicting whether a product sold in several establishments is on sale (y = 1) or not (y = 0), using 17 discrete (d) and 9 continuous (x) variables. The CRISP-DM process was followed. Exploratory analysis of the 3,676 training records showed a moderate class imbalance (20.6% positives), skewed continuous variables, 49 missing values in x9 – all of them with y = 0 – and 170 duplicated records with consistent labels. Data preparation covered missing values (median imputation plus a missingness indicator), outliers, class imbalance (random oversampling, SMOTE, undersampling and class weights) and feature redundancy, and the training data were split into an inner training set (80%) and a hold-out validation set (20%), with stratified 5-fold cross-validation on the former. Ten algorithms – KNN, decision tree, logistic regression, Naive Bayes, MLP, Random Forest, Bagging, AdaBoost, Gradient Boosting and Extra Trees – were tuned and compared using accuracy, precision, recall and F-measure. Tree ensembles clearly outperformed the other families, reaching 94.6%–95.9% validation accuracy versus 88.7% for KNN, 80.6% for logistic regression, 78.9% for the MLP and 53.3% for Naive Bayes. The model selected by cross-validation (AdaBoost, 95.1% CV accuracy) was refitted on the full training set to produce the submission file. Differences among the five best models are smaller than the standard error of the estimates, so no single one can be declared superior.</w:t>
       </w:r>
     </w:p>
     <w:p>
@@ -660,7 +660,7 @@
         <w:rPr>
           <w:b w:val="0"/>
         </w:rPr>
-        <w:t>Treinar, afinar e comparar KNN, árvores de decisão, Naive Bayes, redes neuronais (MLP), Random Forest, Bagging e Boosting, com uma tabela comparativa de accuracy, precision, recall e F-measure.</w:t>
+        <w:t>Treinar, afinar e comparar KNN, árvores de decisão, regressão logística, Naive Bayes, redes neuronais (MLP), Random Forest, Bagging e Boosting, com uma tabela comparativa de accuracy, precision, recall e F-measure.</w:t>
       </w:r>
     </w:p>
     <w:p>
@@ -13546,7 +13546,7 @@
           <w:b w:val="0"/>
           <w:i w:val="0"/>
         </w:rPr>
-        <w:t>Compararam-se nove algoritmos de famílias distintas (Tabela 11). Todos partem do mesmo pré-processamento: imputação pela mediana com indicador de ausência de x9; padronização apenas nos modelos sensíveis à escala (KNN, Naive Bayes e MLP); e reamostragem opcional por SMOTE, escolhida por validação cruzada.</w:t>
+        <w:t>Compararam-se dez algoritmos de famílias distintas (Tabela 11). Todos partem do mesmo pré-processamento: imputação pela mediana com indicador de ausência de x9; padronização apenas nos modelos sensíveis à escala (KNN, Naive Bayes e MLP); e reamostragem opcional por SMOTE, escolhida por validação cruzada.</w:t>
       </w:r>
     </w:p>
     <w:p>
@@ -13770,7 +13770,7 @@
               <w:rPr>
                 <w:sz w:val="17"/>
               </w:rPr>
-              <w:t>Naive Bayes</w:t>
+              <w:t>Regressão Logística</w:t>
             </w:r>
           </w:p>
         </w:tc>
@@ -13788,7 +13788,7 @@
               <w:rPr>
                 <w:sz w:val="17"/>
               </w:rPr>
-              <w:t>Regra de Bayes com independência condicional; Gaussiano</w:t>
+              <w:t>Modelo linear que estima P(y=1) por uma função logística dos preditores, com regularização L2 (Cox, 1958)</w:t>
             </w:r>
           </w:p>
         </w:tc>
@@ -13806,7 +13806,7 @@
               <w:rPr>
                 <w:sz w:val="17"/>
               </w:rPr>
-              <w:t>var_smoothing</w:t>
+              <w:t>C (inverso da regularização)</w:t>
             </w:r>
           </w:p>
         </w:tc>
@@ -13827,7 +13827,7 @@
               <w:rPr>
                 <w:sz w:val="17"/>
               </w:rPr>
-              <w:t>MLP</w:t>
+              <w:t>Naive Bayes</w:t>
             </w:r>
           </w:p>
         </w:tc>
@@ -13846,7 +13846,7 @@
               <w:rPr>
                 <w:sz w:val="17"/>
               </w:rPr>
-              <w:t>Rede neuronal com camadas densas, treinada por retropropagação (Rumelhart et al., 1986)</w:t>
+              <w:t>Regra de Bayes com independência condicional; Gaussiano</w:t>
             </w:r>
           </w:p>
         </w:tc>
@@ -13865,7 +13865,7 @@
               <w:rPr>
                 <w:sz w:val="17"/>
               </w:rPr>
-              <w:t>camadas, regularização L2, taxa de aprendizagem</w:t>
+              <w:t>var_smoothing</w:t>
             </w:r>
           </w:p>
         </w:tc>
@@ -13885,7 +13885,7 @@
               <w:rPr>
                 <w:sz w:val="17"/>
               </w:rPr>
-              <w:t>Random Forest</w:t>
+              <w:t>MLP</w:t>
             </w:r>
           </w:p>
         </w:tc>
@@ -13903,7 +13903,7 @@
               <w:rPr>
                 <w:sz w:val="17"/>
               </w:rPr>
-              <w:t>Bagging de árvores com subconjunto aleatório de variáveis (Breiman, 2001)</w:t>
+              <w:t>Rede neuronal com camadas densas, treinada por retropropagação (Rumelhart et al., 1986)</w:t>
             </w:r>
           </w:p>
         </w:tc>
@@ -13921,7 +13921,7 @@
               <w:rPr>
                 <w:sz w:val="17"/>
               </w:rPr>
-              <w:t>n.º árvores, max_features, folha mínima</w:t>
+              <w:t>camadas, regularização L2, taxa de aprendizagem</w:t>
             </w:r>
           </w:p>
         </w:tc>
@@ -13942,7 +13942,7 @@
               <w:rPr>
                 <w:sz w:val="17"/>
               </w:rPr>
-              <w:t>Bagging</w:t>
+              <w:t>Random Forest</w:t>
             </w:r>
           </w:p>
         </w:tc>
@@ -13961,7 +13961,7 @@
               <w:rPr>
                 <w:sz w:val="17"/>
               </w:rPr>
-              <w:t>Árvores treinadas em amostras bootstrap, votação (Breiman, 1996)</w:t>
+              <w:t>Bagging de árvores com subconjunto aleatório de variáveis (Breiman, 2001)</w:t>
             </w:r>
           </w:p>
         </w:tc>
@@ -13980,7 +13980,7 @@
               <w:rPr>
                 <w:sz w:val="17"/>
               </w:rPr>
-              <w:t>n.º árvores, max_samples, profundidade</w:t>
+              <w:t>n.º árvores, max_features, folha mínima</w:t>
             </w:r>
           </w:p>
         </w:tc>
@@ -14000,7 +14000,7 @@
               <w:rPr>
                 <w:sz w:val="17"/>
               </w:rPr>
-              <w:t>AdaBoost</w:t>
+              <w:t>Bagging</w:t>
             </w:r>
           </w:p>
         </w:tc>
@@ -14018,7 +14018,7 @@
               <w:rPr>
                 <w:sz w:val="17"/>
               </w:rPr>
-              <w:t>Boosting sequencial com reponderação dos erros (Freund &amp; Schapire, 1997)</w:t>
+              <w:t>Árvores treinadas em amostras bootstrap, votação (Breiman, 1996)</w:t>
             </w:r>
           </w:p>
         </w:tc>
@@ -14036,7 +14036,7 @@
               <w:rPr>
                 <w:sz w:val="17"/>
               </w:rPr>
-              <w:t>n.º estimadores, taxa, profundidade base</w:t>
+              <w:t>n.º árvores, max_samples, profundidade</w:t>
             </w:r>
           </w:p>
         </w:tc>
@@ -14057,7 +14057,7 @@
               <w:rPr>
                 <w:sz w:val="17"/>
               </w:rPr>
-              <w:t>Gradient Boosting</w:t>
+              <w:t>AdaBoost</w:t>
             </w:r>
           </w:p>
         </w:tc>
@@ -14076,7 +14076,7 @@
               <w:rPr>
                 <w:sz w:val="17"/>
               </w:rPr>
-              <w:t>Boosting aditivo por gradiente de árvores pequenas (Friedman, 2001)</w:t>
+              <w:t>Boosting sequencial com reponderação dos erros (Freund &amp; Schapire, 1997)</w:t>
             </w:r>
           </w:p>
         </w:tc>
@@ -14095,7 +14095,7 @@
               <w:rPr>
                 <w:sz w:val="17"/>
               </w:rPr>
-              <w:t>n.º árvores, taxa, profundidade, subamostra</w:t>
+              <w:t>n.º estimadores, taxa, profundidade base</w:t>
             </w:r>
           </w:p>
         </w:tc>
@@ -14115,6 +14115,63 @@
               <w:rPr>
                 <w:sz w:val="17"/>
               </w:rPr>
+              <w:t>Gradient Boosting</w:t>
+            </w:r>
+          </w:p>
+        </w:tc>
+        <w:tc>
+          <w:tcPr>
+            <w:tcW w:type="dxa" w:w="4819"/>
+          </w:tcPr>
+          <w:p>
+            <w:pPr>
+              <w:spacing w:after="20" w:line="240" w:lineRule="auto"/>
+              <w:jc w:val="center"/>
+            </w:pPr>
+            <w:r/>
+            <w:r>
+              <w:rPr>
+                <w:sz w:val="17"/>
+              </w:rPr>
+              <w:t>Boosting aditivo por gradiente de árvores pequenas (Friedman, 2001)</w:t>
+            </w:r>
+          </w:p>
+        </w:tc>
+        <w:tc>
+          <w:tcPr>
+            <w:tcW w:type="dxa" w:w="2551"/>
+          </w:tcPr>
+          <w:p>
+            <w:pPr>
+              <w:spacing w:after="20" w:line="240" w:lineRule="auto"/>
+              <w:jc w:val="center"/>
+            </w:pPr>
+            <w:r/>
+            <w:r>
+              <w:rPr>
+                <w:sz w:val="17"/>
+              </w:rPr>
+              <w:t>n.º árvores, taxa, profundidade, subamostra</w:t>
+            </w:r>
+          </w:p>
+        </w:tc>
+      </w:tr>
+      <w:tr>
+        <w:tc>
+          <w:tcPr>
+            <w:tcW w:type="dxa" w:w="1701"/>
+            <w:shd w:val="clear" w:color="auto" w:fill="F2F2F2"/>
+          </w:tcPr>
+          <w:p>
+            <w:pPr>
+              <w:spacing w:after="20" w:line="240" w:lineRule="auto"/>
+              <w:jc w:val="left"/>
+            </w:pPr>
+            <w:r/>
+            <w:r>
+              <w:rPr>
+                <w:sz w:val="17"/>
+              </w:rPr>
               <w:t>Extra Trees</w:t>
             </w:r>
           </w:p>
@@ -14122,6 +14179,7 @@
         <w:tc>
           <w:tcPr>
             <w:tcW w:type="dxa" w:w="4819"/>
+            <w:shd w:val="clear" w:color="auto" w:fill="F2F2F2"/>
           </w:tcPr>
           <w:p>
             <w:pPr>
@@ -14140,6 +14198,7 @@
         <w:tc>
           <w:tcPr>
             <w:tcW w:type="dxa" w:w="2551"/>
+            <w:shd w:val="clear" w:color="auto" w:fill="F2F2F2"/>
           </w:tcPr>
           <w:p>
             <w:pPr>
@@ -14185,7 +14244,21 @@
           <w:b w:val="0"/>
           <w:i w:val="0"/>
         </w:rPr>
-        <w:t xml:space="preserve"> não estava na lista pedida mas foi incluído por ser uma variante de Random Forest muito competitiva em dados de dimensão reduzida; os resultados dos oito algoritmos pedidos podem ser lidos sem ele. Considerou-se o conjunto Random Forest, Bagging, AdaBoost e Gradient Boosting como as famílias de «bagging» e «boosting».</w:t>
+        <w:t xml:space="preserve"> e a </w:t>
+      </w:r>
+      <w:r>
+        <w:rPr>
+          <w:b/>
+          <w:i w:val="0"/>
+        </w:rPr>
+        <w:t>Regressão Logística</w:t>
+      </w:r>
+      <w:r>
+        <w:rPr>
+          <w:b w:val="0"/>
+          <w:i w:val="0"/>
+        </w:rPr>
+        <w:t xml:space="preserve"> não estavam na lista pedida: o primeiro foi incluído por ser uma variante de Random Forest muito competitiva em dados de dimensão reduzida, e a segunda como referência linear simples e interpretável. Os resultados dos oito algoritmos pedidos podem ser lidos sem eles. Considerou-se o conjunto Random Forest, Bagging, AdaBoost e Gradient Boosting como as famílias de «bagging» e «boosting».</w:t>
       </w:r>
     </w:p>
     <w:p>
@@ -15749,6 +15822,153 @@
               <w:rPr>
                 <w:sz w:val="17"/>
               </w:rPr>
+              <w:t>Regressão Logística</w:t>
+            </w:r>
+          </w:p>
+        </w:tc>
+        <w:tc>
+          <w:tcPr>
+            <w:tcW w:type="dxa" w:w="1134"/>
+          </w:tcPr>
+          <w:p>
+            <w:pPr>
+              <w:spacing w:after="20" w:line="240" w:lineRule="auto"/>
+              <w:jc w:val="center"/>
+            </w:pPr>
+            <w:r/>
+            <w:r>
+              <w:rPr>
+                <w:sz w:val="17"/>
+              </w:rPr>
+              <w:t>0,8133 ± 0,0072</w:t>
+            </w:r>
+          </w:p>
+        </w:tc>
+        <w:tc>
+          <w:tcPr>
+            <w:tcW w:type="dxa" w:w="1134"/>
+          </w:tcPr>
+          <w:p>
+            <w:pPr>
+              <w:spacing w:after="20" w:line="240" w:lineRule="auto"/>
+              <w:jc w:val="center"/>
+            </w:pPr>
+            <w:r/>
+            <w:r>
+              <w:rPr>
+                <w:sz w:val="17"/>
+              </w:rPr>
+              <w:t>0,284</w:t>
+            </w:r>
+          </w:p>
+        </w:tc>
+        <w:tc>
+          <w:tcPr>
+            <w:tcW w:type="dxa" w:w="1134"/>
+          </w:tcPr>
+          <w:p>
+            <w:pPr>
+              <w:spacing w:after="20" w:line="240" w:lineRule="auto"/>
+              <w:jc w:val="center"/>
+            </w:pPr>
+            <w:r/>
+            <w:r>
+              <w:rPr>
+                <w:sz w:val="17"/>
+              </w:rPr>
+              <w:t>0,806</w:t>
+            </w:r>
+          </w:p>
+        </w:tc>
+        <w:tc>
+          <w:tcPr>
+            <w:tcW w:type="dxa" w:w="1134"/>
+          </w:tcPr>
+          <w:p>
+            <w:pPr>
+              <w:spacing w:after="20" w:line="240" w:lineRule="auto"/>
+              <w:jc w:val="center"/>
+            </w:pPr>
+            <w:r/>
+            <w:r>
+              <w:rPr>
+                <w:sz w:val="17"/>
+              </w:rPr>
+              <w:t>0,600</w:t>
+            </w:r>
+          </w:p>
+        </w:tc>
+        <w:tc>
+          <w:tcPr>
+            <w:tcW w:type="dxa" w:w="1134"/>
+          </w:tcPr>
+          <w:p>
+            <w:pPr>
+              <w:spacing w:after="20" w:line="240" w:lineRule="auto"/>
+              <w:jc w:val="center"/>
+            </w:pPr>
+            <w:r/>
+            <w:r>
+              <w:rPr>
+                <w:sz w:val="17"/>
+              </w:rPr>
+              <w:t>0,159</w:t>
+            </w:r>
+          </w:p>
+        </w:tc>
+        <w:tc>
+          <w:tcPr>
+            <w:tcW w:type="dxa" w:w="1134"/>
+          </w:tcPr>
+          <w:p>
+            <w:pPr>
+              <w:spacing w:after="20" w:line="240" w:lineRule="auto"/>
+              <w:jc w:val="center"/>
+            </w:pPr>
+            <w:r/>
+            <w:r>
+              <w:rPr>
+                <w:sz w:val="17"/>
+              </w:rPr>
+              <w:t>0,251</w:t>
+            </w:r>
+          </w:p>
+        </w:tc>
+        <w:tc>
+          <w:tcPr>
+            <w:tcW w:type="dxa" w:w="1134"/>
+          </w:tcPr>
+          <w:p>
+            <w:pPr>
+              <w:spacing w:after="20" w:line="240" w:lineRule="auto"/>
+              <w:jc w:val="center"/>
+            </w:pPr>
+            <w:r/>
+            <w:r>
+              <w:rPr>
+                <w:sz w:val="17"/>
+              </w:rPr>
+              <w:t>0,762</w:t>
+            </w:r>
+          </w:p>
+        </w:tc>
+      </w:tr>
+      <w:tr>
+        <w:tc>
+          <w:tcPr>
+            <w:tcW w:type="dxa" w:w="1134"/>
+            <w:shd w:val="clear" w:color="auto" w:fill="F2F2F2"/>
+          </w:tcPr>
+          <w:p>
+            <w:pPr>
+              <w:spacing w:after="20" w:line="240" w:lineRule="auto"/>
+              <w:jc w:val="left"/>
+            </w:pPr>
+            <w:r/>
+            <w:r>
+              <w:rPr>
+                <w:sz w:val="17"/>
+              </w:rPr>
               <w:t>Naive Bayes</w:t>
             </w:r>
           </w:p>
@@ -15756,6 +15976,7 @@
         <w:tc>
           <w:tcPr>
             <w:tcW w:type="dxa" w:w="1134"/>
+            <w:shd w:val="clear" w:color="auto" w:fill="F2F2F2"/>
           </w:tcPr>
           <w:p>
             <w:pPr>
@@ -15774,6 +15995,7 @@
         <w:tc>
           <w:tcPr>
             <w:tcW w:type="dxa" w:w="1134"/>
+            <w:shd w:val="clear" w:color="auto" w:fill="F2F2F2"/>
           </w:tcPr>
           <w:p>
             <w:pPr>
@@ -15792,6 +16014,7 @@
         <w:tc>
           <w:tcPr>
             <w:tcW w:type="dxa" w:w="1134"/>
+            <w:shd w:val="clear" w:color="auto" w:fill="F2F2F2"/>
           </w:tcPr>
           <w:p>
             <w:pPr>
@@ -15810,6 +16033,7 @@
         <w:tc>
           <w:tcPr>
             <w:tcW w:type="dxa" w:w="1134"/>
+            <w:shd w:val="clear" w:color="auto" w:fill="F2F2F2"/>
           </w:tcPr>
           <w:p>
             <w:pPr>
@@ -15828,6 +16052,7 @@
         <w:tc>
           <w:tcPr>
             <w:tcW w:type="dxa" w:w="1134"/>
+            <w:shd w:val="clear" w:color="auto" w:fill="F2F2F2"/>
           </w:tcPr>
           <w:p>
             <w:pPr>
@@ -15846,6 +16071,7 @@
         <w:tc>
           <w:tcPr>
             <w:tcW w:type="dxa" w:w="1134"/>
+            <w:shd w:val="clear" w:color="auto" w:fill="F2F2F2"/>
           </w:tcPr>
           <w:p>
             <w:pPr>
@@ -15864,6 +16090,7 @@
         <w:tc>
           <w:tcPr>
             <w:tcW w:type="dxa" w:w="1134"/>
+            <w:shd w:val="clear" w:color="auto" w:fill="F2F2F2"/>
           </w:tcPr>
           <w:p>
             <w:pPr>
@@ -16014,13 +16241,13 @@
         <w:rPr>
           <w:b/>
         </w:rPr>
-        <w:t>KNN, MLP e Naive Bayes:</w:t>
+        <w:t>Regressão logística, KNN, MLP e Naive Bayes:</w:t>
       </w:r>
       <w:r>
         <w:rPr>
           <w:b w:val="0"/>
         </w:rPr>
-        <w:t xml:space="preserve"> claramente inferiores. O KNN (0,887) supera a baseline mas tem recall baixo (0,609); o MLP (0,789 na validação) fica abaixo da baseline na accuracy, apesar de recall de 0,748; o Naive Bayes (0,533) é pior do que classificar tudo como «sem desconto».</w:t>
+        <w:t xml:space="preserve"> claramente inferiores. A regressão logística (0,806 na validação, 0,813 em CV) mal supera a baseline (79,5% na validação) e tem recall de apenas 0,159 (24 de 151 positivos identificados), pelo que a fronteira de decisão é fortemente não linear. O KNN (0,887) supera a baseline mas tem recall baixo (0,609); o MLP (0,789 na validação) fica abaixo da baseline na accuracy, apesar de recall de 0,748; o Naive Bayes (0,533) é pior do que classificar tudo como «sem desconto».</w:t>
       </w:r>
     </w:p>
     <w:p>
@@ -16046,7 +16273,7 @@
           <w:b w:val="0"/>
           <w:i w:val="0"/>
         </w:rPr>
-        <w:t xml:space="preserve"> O que é estatisticamente claro é a superioridade deste grupo sobre KNN, MLP e Naive Bayes.</w:t>
+        <w:t xml:space="preserve"> O que é estatisticamente claro é a superioridade deste grupo sobre a regressão logística, o KNN, o MLP e o Naive Bayes.</w:t>
       </w:r>
     </w:p>
     <w:p>
@@ -16095,6 +16322,26 @@
           <w:i w:val="0"/>
         </w:rPr>
         <w:t>A árvore ótima não tem limite de profundidade, usa o critério de Gini e foi treinada com SMOTE. Na validação obtém 0,942 de accuracy com 130 verdadeiros positivos e 21 falsos negativos – o menor número de falsos negativos, a par do Extra Trees – ao custo de 22 falsos positivos. É o modelo mais interpretável, mas tem, porém, accuracy em CV (0,919) 2,2 pontos abaixo da obtida na validação (0,942), uma diferença maior do que nos conjuntos de árvores, que pode refletir a presença, na validação, de registos idênticos a registos de treino.</w:t>
+      </w:r>
+    </w:p>
+    <w:p>
+      <w:pPr>
+        <w:pStyle w:val="Heading3"/>
+      </w:pPr>
+      <w:r>
+        <w:t>Regressão logística</w:t>
+      </w:r>
+    </w:p>
+    <w:p>
+      <w:pPr>
+        <w:jc w:val="both"/>
+      </w:pPr>
+      <w:r>
+        <w:rPr>
+          <w:b w:val="0"/>
+          <w:i w:val="0"/>
+        </w:rPr>
+        <w:t>A melhor configuração usou C = 10 (regularização L2 fraca), sem reamostragem. Na validação obtém accuracy de 0,806, precision de 0,600, recall de 0,159, F-measure de 0,251 e AUC de 0,762: classifica corretamente 569 dos 585 negativos mas só 24 dos 151 positivos (127 falsos negativos). Como a accuracy é só 1,1 pontos percentuais superior à baseline de 79,5%, o modelo é, na prática, pouco melhor do que prever sempre «sem desconto». A regressão logística só capta efeitos lineares e aditivos nas variáveis padronizadas, ao passo que os modelos de árvores exploram interações e limiares; as correlações lineares fracas com y (secção 2.2.4) já antecipavam esta limitação. Mantém, em contrapartida, a vantagem de os coeficientes serem interpretáveis, e funciona como referência para quantificar o ganho dos modelos não lineares (cerca de 14 a 15 pontos percentuais de accuracy).</w:t>
       </w:r>
     </w:p>
     <w:p>
@@ -16238,7 +16485,7 @@
       <w:r>
         <w:drawing>
           <wp:inline xmlns:a="http://schemas.openxmlformats.org/drawingml/2006/main" xmlns:pic="http://schemas.openxmlformats.org/drawingml/2006/picture">
-            <wp:extent cx="5040000" cy="4536000"/>
+            <wp:extent cx="4500000" cy="5400000"/>
             <wp:docPr id="15" name="Picture 15"/>
             <wp:cNvGraphicFramePr>
               <a:graphicFrameLocks noChangeAspect="1"/>
@@ -16259,7 +16506,7 @@
                   <pic:spPr>
                     <a:xfrm>
                       <a:off x="0" y="0"/>
-                      <a:ext cx="5040000" cy="4536000"/>
+                      <a:ext cx="4500000" cy="5400000"/>
                     </a:xfrm>
                     <a:prstGeom prst="rect"/>
                   </pic:spPr>
@@ -16622,7 +16869,7 @@
               <w:rPr>
                 <w:sz w:val="18"/>
               </w:rPr>
-              <w:t>Naive Bayes</w:t>
+              <w:t>Regressão Logística</w:t>
             </w:r>
           </w:p>
         </w:tc>
@@ -16640,7 +16887,7 @@
               <w:rPr>
                 <w:sz w:val="18"/>
               </w:rPr>
-              <w:t>271</w:t>
+              <w:t>569</w:t>
             </w:r>
           </w:p>
         </w:tc>
@@ -16658,7 +16905,7 @@
               <w:rPr>
                 <w:sz w:val="18"/>
               </w:rPr>
-              <w:t>314</w:t>
+              <w:t>16</w:t>
             </w:r>
           </w:p>
         </w:tc>
@@ -16676,7 +16923,7 @@
               <w:rPr>
                 <w:sz w:val="18"/>
               </w:rPr>
-              <w:t>30</w:t>
+              <w:t>127</w:t>
             </w:r>
           </w:p>
         </w:tc>
@@ -16694,7 +16941,7 @@
               <w:rPr>
                 <w:sz w:val="18"/>
               </w:rPr>
-              <w:t>121</w:t>
+              <w:t>24</w:t>
             </w:r>
           </w:p>
         </w:tc>
@@ -16715,7 +16962,7 @@
               <w:rPr>
                 <w:sz w:val="18"/>
               </w:rPr>
-              <w:t>MLP</w:t>
+              <w:t>Naive Bayes</w:t>
             </w:r>
           </w:p>
         </w:tc>
@@ -16734,7 +16981,7 @@
               <w:rPr>
                 <w:sz w:val="18"/>
               </w:rPr>
-              <w:t>468</w:t>
+              <w:t>271</w:t>
             </w:r>
           </w:p>
         </w:tc>
@@ -16753,7 +17000,7 @@
               <w:rPr>
                 <w:sz w:val="18"/>
               </w:rPr>
-              <w:t>117</w:t>
+              <w:t>314</w:t>
             </w:r>
           </w:p>
         </w:tc>
@@ -16772,7 +17019,7 @@
               <w:rPr>
                 <w:sz w:val="18"/>
               </w:rPr>
-              <w:t>38</w:t>
+              <w:t>30</w:t>
             </w:r>
           </w:p>
         </w:tc>
@@ -16791,7 +17038,7 @@
               <w:rPr>
                 <w:sz w:val="18"/>
               </w:rPr>
-              <w:t>113</w:t>
+              <w:t>121</w:t>
             </w:r>
           </w:p>
         </w:tc>
@@ -16811,7 +17058,7 @@
               <w:rPr>
                 <w:sz w:val="18"/>
               </w:rPr>
-              <w:t>Random Forest</w:t>
+              <w:t>MLP</w:t>
             </w:r>
           </w:p>
         </w:tc>
@@ -16829,7 +17076,7 @@
               <w:rPr>
                 <w:sz w:val="18"/>
               </w:rPr>
-              <w:t>573</w:t>
+              <w:t>468</w:t>
             </w:r>
           </w:p>
         </w:tc>
@@ -16847,7 +17094,7 @@
               <w:rPr>
                 <w:sz w:val="18"/>
               </w:rPr>
-              <w:t>12</w:t>
+              <w:t>117</w:t>
             </w:r>
           </w:p>
         </w:tc>
@@ -16865,7 +17112,7 @@
               <w:rPr>
                 <w:sz w:val="18"/>
               </w:rPr>
-              <w:t>25</w:t>
+              <w:t>38</w:t>
             </w:r>
           </w:p>
         </w:tc>
@@ -16883,7 +17130,7 @@
               <w:rPr>
                 <w:sz w:val="18"/>
               </w:rPr>
-              <w:t>126</w:t>
+              <w:t>113</w:t>
             </w:r>
           </w:p>
         </w:tc>
@@ -16904,7 +17151,7 @@
               <w:rPr>
                 <w:sz w:val="18"/>
               </w:rPr>
-              <w:t>Bagging</w:t>
+              <w:t>Random Forest</w:t>
             </w:r>
           </w:p>
         </w:tc>
@@ -16923,7 +17170,7 @@
               <w:rPr>
                 <w:sz w:val="18"/>
               </w:rPr>
-              <w:t>577</w:t>
+              <w:t>573</w:t>
             </w:r>
           </w:p>
         </w:tc>
@@ -16942,7 +17189,7 @@
               <w:rPr>
                 <w:sz w:val="18"/>
               </w:rPr>
-              <w:t>8</w:t>
+              <w:t>12</w:t>
             </w:r>
           </w:p>
         </w:tc>
@@ -16961,7 +17208,7 @@
               <w:rPr>
                 <w:sz w:val="18"/>
               </w:rPr>
-              <w:t>22</w:t>
+              <w:t>25</w:t>
             </w:r>
           </w:p>
         </w:tc>
@@ -16980,7 +17227,7 @@
               <w:rPr>
                 <w:sz w:val="18"/>
               </w:rPr>
-              <w:t>129</w:t>
+              <w:t>126</w:t>
             </w:r>
           </w:p>
         </w:tc>
@@ -17000,7 +17247,7 @@
               <w:rPr>
                 <w:sz w:val="18"/>
               </w:rPr>
-              <w:t>AdaBoost</w:t>
+              <w:t>Bagging</w:t>
             </w:r>
           </w:p>
         </w:tc>
@@ -17018,7 +17265,7 @@
               <w:rPr>
                 <w:sz w:val="18"/>
               </w:rPr>
-              <w:t>572</w:t>
+              <w:t>577</w:t>
             </w:r>
           </w:p>
         </w:tc>
@@ -17036,7 +17283,7 @@
               <w:rPr>
                 <w:sz w:val="18"/>
               </w:rPr>
-              <w:t>13</w:t>
+              <w:t>8</w:t>
             </w:r>
           </w:p>
         </w:tc>
@@ -17054,7 +17301,7 @@
               <w:rPr>
                 <w:sz w:val="18"/>
               </w:rPr>
-              <w:t>27</w:t>
+              <w:t>22</w:t>
             </w:r>
           </w:p>
         </w:tc>
@@ -17072,7 +17319,7 @@
               <w:rPr>
                 <w:sz w:val="18"/>
               </w:rPr>
-              <w:t>124</w:t>
+              <w:t>129</w:t>
             </w:r>
           </w:p>
         </w:tc>
@@ -17093,7 +17340,7 @@
               <w:rPr>
                 <w:sz w:val="18"/>
               </w:rPr>
-              <w:t>Gradient Boosting</w:t>
+              <w:t>AdaBoost</w:t>
             </w:r>
           </w:p>
         </w:tc>
@@ -17112,7 +17359,7 @@
               <w:rPr>
                 <w:sz w:val="18"/>
               </w:rPr>
-              <w:t>576</w:t>
+              <w:t>572</w:t>
             </w:r>
           </w:p>
         </w:tc>
@@ -17131,7 +17378,7 @@
               <w:rPr>
                 <w:sz w:val="18"/>
               </w:rPr>
-              <w:t>9</w:t>
+              <w:t>13</w:t>
             </w:r>
           </w:p>
         </w:tc>
@@ -17189,6 +17436,99 @@
               <w:rPr>
                 <w:sz w:val="18"/>
               </w:rPr>
+              <w:t>Gradient Boosting</w:t>
+            </w:r>
+          </w:p>
+        </w:tc>
+        <w:tc>
+          <w:tcPr>
+            <w:tcW w:type="dxa" w:w="1134"/>
+          </w:tcPr>
+          <w:p>
+            <w:pPr>
+              <w:spacing w:after="20" w:line="240" w:lineRule="auto"/>
+              <w:jc w:val="center"/>
+            </w:pPr>
+            <w:r/>
+            <w:r>
+              <w:rPr>
+                <w:sz w:val="18"/>
+              </w:rPr>
+              <w:t>576</w:t>
+            </w:r>
+          </w:p>
+        </w:tc>
+        <w:tc>
+          <w:tcPr>
+            <w:tcW w:type="dxa" w:w="1134"/>
+          </w:tcPr>
+          <w:p>
+            <w:pPr>
+              <w:spacing w:after="20" w:line="240" w:lineRule="auto"/>
+              <w:jc w:val="center"/>
+            </w:pPr>
+            <w:r/>
+            <w:r>
+              <w:rPr>
+                <w:sz w:val="18"/>
+              </w:rPr>
+              <w:t>9</w:t>
+            </w:r>
+          </w:p>
+        </w:tc>
+        <w:tc>
+          <w:tcPr>
+            <w:tcW w:type="dxa" w:w="1134"/>
+          </w:tcPr>
+          <w:p>
+            <w:pPr>
+              <w:spacing w:after="20" w:line="240" w:lineRule="auto"/>
+              <w:jc w:val="center"/>
+            </w:pPr>
+            <w:r/>
+            <w:r>
+              <w:rPr>
+                <w:sz w:val="18"/>
+              </w:rPr>
+              <w:t>27</w:t>
+            </w:r>
+          </w:p>
+        </w:tc>
+        <w:tc>
+          <w:tcPr>
+            <w:tcW w:type="dxa" w:w="1134"/>
+          </w:tcPr>
+          <w:p>
+            <w:pPr>
+              <w:spacing w:after="20" w:line="240" w:lineRule="auto"/>
+              <w:jc w:val="center"/>
+            </w:pPr>
+            <w:r/>
+            <w:r>
+              <w:rPr>
+                <w:sz w:val="18"/>
+              </w:rPr>
+              <w:t>124</w:t>
+            </w:r>
+          </w:p>
+        </w:tc>
+      </w:tr>
+      <w:tr>
+        <w:tc>
+          <w:tcPr>
+            <w:tcW w:type="dxa" w:w="2551"/>
+            <w:shd w:val="clear" w:color="auto" w:fill="F2F2F2"/>
+          </w:tcPr>
+          <w:p>
+            <w:pPr>
+              <w:spacing w:after="20" w:line="240" w:lineRule="auto"/>
+              <w:jc w:val="left"/>
+            </w:pPr>
+            <w:r/>
+            <w:r>
+              <w:rPr>
+                <w:sz w:val="18"/>
+              </w:rPr>
               <w:t>Extra Trees</w:t>
             </w:r>
           </w:p>
@@ -17196,6 +17536,7 @@
         <w:tc>
           <w:tcPr>
             <w:tcW w:type="dxa" w:w="1134"/>
+            <w:shd w:val="clear" w:color="auto" w:fill="F2F2F2"/>
           </w:tcPr>
           <w:p>
             <w:pPr>
@@ -17214,6 +17555,7 @@
         <w:tc>
           <w:tcPr>
             <w:tcW w:type="dxa" w:w="1134"/>
+            <w:shd w:val="clear" w:color="auto" w:fill="F2F2F2"/>
           </w:tcPr>
           <w:p>
             <w:pPr>
@@ -17232,6 +17574,7 @@
         <w:tc>
           <w:tcPr>
             <w:tcW w:type="dxa" w:w="1134"/>
+            <w:shd w:val="clear" w:color="auto" w:fill="F2F2F2"/>
           </w:tcPr>
           <w:p>
             <w:pPr>
@@ -17250,6 +17593,7 @@
         <w:tc>
           <w:tcPr>
             <w:tcW w:type="dxa" w:w="1134"/>
+            <w:shd w:val="clear" w:color="auto" w:fill="F2F2F2"/>
           </w:tcPr>
           <w:p>
             <w:pPr>
@@ -17928,7 +18272,7 @@
           <w:b w:val="0"/>
           <w:i w:val="0"/>
         </w:rPr>
-        <w:t>Dos nove algoritmos comparados, os conjuntos de árvores (Bagging, Extra Trees, Gradient Boosting, Random Forest e AdaBoost) alcançaram accuracy entre 94,6% e 95,9% na validação, F-measure entre 0,86 e 0,90 e AUC entre 0,96 e 0,98, bastante acima da baseline de 79,4%, do KNN (88,7%), do MLP (78,9%) e do Naive Bayes (53,3%). A superioridade das árvores é coerente com a natureza dos dados: muitas variáveis binárias, variáveis de baixa cardinalidade, assimetrias e interações. Os cinco melhores modelos são, no entanto, estatisticamente indistinguíveis; o AdaBoost foi escolhido por apresentar a maior accuracy em validação cruzada.</w:t>
+        <w:t>Dos dez algoritmos comparados, os conjuntos de árvores (Bagging, Extra Trees, Gradient Boosting, Random Forest e AdaBoost) alcançaram accuracy entre 94,6% e 95,9% na validação, F-measure entre 0,86 e 0,90 e AUC entre 0,96 e 0,98, bastante acima da baseline de 79,4%, da regressão logística (80,6%), do KNN (88,7%), do MLP (78,9%) e do Naive Bayes (53,3%). A superioridade das árvores é coerente com a natureza dos dados: muitas variáveis binárias, variáveis de baixa cardinalidade, assimetrias e interações. Os cinco melhores modelos são, no entanto, estatisticamente indistinguíveis; o AdaBoost foi escolhido por apresentar a maior accuracy em validação cruzada.</w:t>
       </w:r>
     </w:p>
     <w:p>
@@ -18119,6 +18463,15 @@
         <w:ind w:left="454" w:hanging="454"/>
       </w:pPr>
       <w:r>
+        <w:t>Cox, D. R. (1958). The regression analysis of binary sequences. Journal of the Royal Statistical Society: Series B, 20(2), 215–242.</w:t>
+      </w:r>
+    </w:p>
+    <w:p>
+      <w:pPr>
+        <w:spacing w:after="60"/>
+        <w:ind w:left="454" w:hanging="454"/>
+      </w:pPr>
+      <w:r>
         <w:t>Freund, Y., &amp; Schapire, R. E. (1997). A decision-theoretic generalization of on-line learning and an application to boosting. Journal of Computer and System Sciences, 55(1), 119–139.</w:t>
       </w:r>
     </w:p>
@@ -18401,7 +18754,7 @@
               <w:rPr>
                 <w:sz w:val="16"/>
               </w:rPr>
-              <w:t>Naive Bayes</w:t>
+              <w:t>Regressão Logística</w:t>
             </w:r>
           </w:p>
         </w:tc>
@@ -18419,7 +18772,7 @@
               <w:rPr>
                 <w:sz w:val="16"/>
               </w:rPr>
-              <w:t>var_smoothing ∈ {1e-9,1e-6,1e-3,1e-1}; reamostragem</w:t>
+              <w:t>C ∈ {0,01; 0,1; 1; 10; 100}; penalização L2; reamostragem; máx. 3000 iterações</w:t>
             </w:r>
           </w:p>
         </w:tc>
@@ -18437,7 +18790,7 @@
               <w:rPr>
                 <w:sz w:val="16"/>
               </w:rPr>
-              <w:t>8</w:t>
+              <w:t>10</w:t>
             </w:r>
           </w:p>
         </w:tc>
@@ -18458,7 +18811,7 @@
               <w:rPr>
                 <w:sz w:val="16"/>
               </w:rPr>
-              <w:t>MLP</w:t>
+              <w:t>Naive Bayes</w:t>
             </w:r>
           </w:p>
         </w:tc>
@@ -18477,7 +18830,7 @@
               <w:rPr>
                 <w:sz w:val="16"/>
               </w:rPr>
-              <w:t>hidden_layer_sizes ∈ {(32),(64),(64,32)}; alpha ∈ {1e-4,1e-2}; learning_rate_init ∈ {1e-3,1e-2}; reamostragem; early stopping, máx. 600 iterações</w:t>
+              <w:t>var_smoothing ∈ {1e-9,1e-6,1e-3,1e-1}; reamostragem</w:t>
             </w:r>
           </w:p>
         </w:tc>
@@ -18496,7 +18849,7 @@
               <w:rPr>
                 <w:sz w:val="16"/>
               </w:rPr>
-              <w:t>24</w:t>
+              <w:t>8</w:t>
             </w:r>
           </w:p>
         </w:tc>
@@ -18516,7 +18869,7 @@
               <w:rPr>
                 <w:sz w:val="16"/>
               </w:rPr>
-              <w:t>Random Forest</w:t>
+              <w:t>MLP</w:t>
             </w:r>
           </w:p>
         </w:tc>
@@ -18534,7 +18887,7 @@
               <w:rPr>
                 <w:sz w:val="16"/>
               </w:rPr>
-              <w:t>n_estimators ∈ {300,600}; max_features ∈ {sqrt, 0,5}; min_samples_leaf ∈ {1,2}; reamostragem</w:t>
+              <w:t>hidden_layer_sizes ∈ {(32),(64),(64,32)}; alpha ∈ {1e-4,1e-2}; learning_rate_init ∈ {1e-3,1e-2}; reamostragem; early stopping, máx. 600 iterações</w:t>
             </w:r>
           </w:p>
         </w:tc>
@@ -18552,7 +18905,7 @@
               <w:rPr>
                 <w:sz w:val="16"/>
               </w:rPr>
-              <w:t>16</w:t>
+              <w:t>24</w:t>
             </w:r>
           </w:p>
         </w:tc>
@@ -18573,7 +18926,7 @@
               <w:rPr>
                 <w:sz w:val="16"/>
               </w:rPr>
-              <w:t>Bagging</w:t>
+              <w:t>Random Forest</w:t>
             </w:r>
           </w:p>
         </w:tc>
@@ -18592,7 +18945,7 @@
               <w:rPr>
                 <w:sz w:val="16"/>
               </w:rPr>
-              <w:t>n_estimators ∈ {50,200}; max_samples ∈ {0,7; 1,0}; profundidade da árvore base ∈ {None,12}; reamostragem</w:t>
+              <w:t>n_estimators ∈ {300,600}; max_features ∈ {sqrt, 0,5}; min_samples_leaf ∈ {1,2}; reamostragem</w:t>
             </w:r>
           </w:p>
         </w:tc>
@@ -18631,7 +18984,7 @@
               <w:rPr>
                 <w:sz w:val="16"/>
               </w:rPr>
-              <w:t>AdaBoost</w:t>
+              <w:t>Bagging</w:t>
             </w:r>
           </w:p>
         </w:tc>
@@ -18649,7 +19002,7 @@
               <w:rPr>
                 <w:sz w:val="16"/>
               </w:rPr>
-              <w:t>n_estimators ∈ {100,300}; learning_rate ∈ {0,3; 1,0}; profundidade da árvore base ∈ {1,3,5}; reamostragem</w:t>
+              <w:t>n_estimators ∈ {50,200}; max_samples ∈ {0,7; 1,0}; profundidade da árvore base ∈ {None,12}; reamostragem</w:t>
             </w:r>
           </w:p>
         </w:tc>
@@ -18667,7 +19020,7 @@
               <w:rPr>
                 <w:sz w:val="16"/>
               </w:rPr>
-              <w:t>24</w:t>
+              <w:t>16</w:t>
             </w:r>
           </w:p>
         </w:tc>
@@ -18688,7 +19041,7 @@
               <w:rPr>
                 <w:sz w:val="16"/>
               </w:rPr>
-              <w:t>Gradient Boosting</w:t>
+              <w:t>AdaBoost</w:t>
             </w:r>
           </w:p>
         </w:tc>
@@ -18707,7 +19060,7 @@
               <w:rPr>
                 <w:sz w:val="16"/>
               </w:rPr>
-              <w:t>n_estimators ∈ {200,500}; learning_rate ∈ {0,05; 0,1}; max_depth ∈ {3,5,7}; subsample ∈ {0,8; 1,0}; reamostragem (pesquisa aleatória)</w:t>
+              <w:t>n_estimators ∈ {100,300}; learning_rate ∈ {0,3; 1,0}; profundidade da árvore base ∈ {1,3,5}; reamostragem</w:t>
             </w:r>
           </w:p>
         </w:tc>
@@ -18726,7 +19079,7 @@
               <w:rPr>
                 <w:sz w:val="16"/>
               </w:rPr>
-              <w:t>12 de 48</w:t>
+              <w:t>24</w:t>
             </w:r>
           </w:p>
         </w:tc>
@@ -18746,6 +19099,63 @@
               <w:rPr>
                 <w:sz w:val="16"/>
               </w:rPr>
+              <w:t>Gradient Boosting</w:t>
+            </w:r>
+          </w:p>
+        </w:tc>
+        <w:tc>
+          <w:tcPr>
+            <w:tcW w:type="dxa" w:w="6236"/>
+          </w:tcPr>
+          <w:p>
+            <w:pPr>
+              <w:spacing w:after="20" w:line="240" w:lineRule="auto"/>
+              <w:jc w:val="center"/>
+            </w:pPr>
+            <w:r/>
+            <w:r>
+              <w:rPr>
+                <w:sz w:val="16"/>
+              </w:rPr>
+              <w:t>n_estimators ∈ {200,500}; learning_rate ∈ {0,05; 0,1}; max_depth ∈ {3,5,7}; subsample ∈ {0,8; 1,0}; reamostragem (pesquisa aleatória)</w:t>
+            </w:r>
+          </w:p>
+        </w:tc>
+        <w:tc>
+          <w:tcPr>
+            <w:tcW w:type="dxa" w:w="1134"/>
+          </w:tcPr>
+          <w:p>
+            <w:pPr>
+              <w:spacing w:after="20" w:line="240" w:lineRule="auto"/>
+              <w:jc w:val="center"/>
+            </w:pPr>
+            <w:r/>
+            <w:r>
+              <w:rPr>
+                <w:sz w:val="16"/>
+              </w:rPr>
+              <w:t>12 de 48</w:t>
+            </w:r>
+          </w:p>
+        </w:tc>
+      </w:tr>
+      <w:tr>
+        <w:tc>
+          <w:tcPr>
+            <w:tcW w:type="dxa" w:w="1701"/>
+            <w:shd w:val="clear" w:color="auto" w:fill="F2F2F2"/>
+          </w:tcPr>
+          <w:p>
+            <w:pPr>
+              <w:spacing w:after="20" w:line="240" w:lineRule="auto"/>
+              <w:jc w:val="left"/>
+            </w:pPr>
+            <w:r/>
+            <w:r>
+              <w:rPr>
+                <w:sz w:val="16"/>
+              </w:rPr>
               <w:t>Extra Trees</w:t>
             </w:r>
           </w:p>
@@ -18753,6 +19163,7 @@
         <w:tc>
           <w:tcPr>
             <w:tcW w:type="dxa" w:w="6236"/>
+            <w:shd w:val="clear" w:color="auto" w:fill="F2F2F2"/>
           </w:tcPr>
           <w:p>
             <w:pPr>
@@ -18771,6 +19182,7 @@
         <w:tc>
           <w:tcPr>
             <w:tcW w:type="dxa" w:w="1134"/>
+            <w:shd w:val="clear" w:color="auto" w:fill="F2F2F2"/>
           </w:tcPr>
           <w:p>
             <w:pPr>
@@ -19014,7 +19426,7 @@
               <w:rPr>
                 <w:sz w:val="16"/>
               </w:rPr>
-              <w:t>Naive Bayes</w:t>
+              <w:t>Regressão Logística</w:t>
             </w:r>
           </w:p>
         </w:tc>
@@ -19032,7 +19444,7 @@
               <w:rPr>
                 <w:sz w:val="16"/>
               </w:rPr>
-              <w:t>var_smoothing=0.1</w:t>
+              <w:t>C=10</w:t>
             </w:r>
           </w:p>
         </w:tc>
@@ -19071,7 +19483,7 @@
               <w:rPr>
                 <w:sz w:val="16"/>
               </w:rPr>
-              <w:t>MLP</w:t>
+              <w:t>Naive Bayes</w:t>
             </w:r>
           </w:p>
         </w:tc>
@@ -19090,7 +19502,7 @@
               <w:rPr>
                 <w:sz w:val="16"/>
               </w:rPr>
-              <w:t>alpha=0.0001; hidden_layer_sizes=[64, 32]; learning_rate_init=0.01</w:t>
+              <w:t>var_smoothing=0.1</w:t>
             </w:r>
           </w:p>
         </w:tc>
@@ -19109,7 +19521,7 @@
               <w:rPr>
                 <w:sz w:val="16"/>
               </w:rPr>
-              <w:t>SMOTE</w:t>
+              <w:t>nenhuma</w:t>
             </w:r>
           </w:p>
         </w:tc>
@@ -19129,7 +19541,7 @@
               <w:rPr>
                 <w:sz w:val="16"/>
               </w:rPr>
-              <w:t>Random Forest</w:t>
+              <w:t>MLP</w:t>
             </w:r>
           </w:p>
         </w:tc>
@@ -19147,7 +19559,7 @@
               <w:rPr>
                 <w:sz w:val="16"/>
               </w:rPr>
-              <w:t>max_features=0.5; min_samples_leaf=1; n_estimators=600</w:t>
+              <w:t>alpha=0.0001; hidden_layer_sizes=[64, 32]; learning_rate_init=0.01</w:t>
             </w:r>
           </w:p>
         </w:tc>
@@ -19186,7 +19598,7 @@
               <w:rPr>
                 <w:sz w:val="16"/>
               </w:rPr>
-              <w:t>Bagging</w:t>
+              <w:t>Random Forest</w:t>
             </w:r>
           </w:p>
         </w:tc>
@@ -19205,7 +19617,7 @@
               <w:rPr>
                 <w:sz w:val="16"/>
               </w:rPr>
-              <w:t>base_max_depth=None; max_samples=1.0; n_estimators=50</w:t>
+              <w:t>max_features=0.5; min_samples_leaf=1; n_estimators=600</w:t>
             </w:r>
           </w:p>
         </w:tc>
@@ -19244,7 +19656,7 @@
               <w:rPr>
                 <w:sz w:val="16"/>
               </w:rPr>
-              <w:t>AdaBoost</w:t>
+              <w:t>Bagging</w:t>
             </w:r>
           </w:p>
         </w:tc>
@@ -19262,7 +19674,7 @@
               <w:rPr>
                 <w:sz w:val="16"/>
               </w:rPr>
-              <w:t>base_max_depth=5; learning_rate=1.0; n_estimators=300</w:t>
+              <w:t>base_max_depth=None; max_samples=1.0; n_estimators=50</w:t>
             </w:r>
           </w:p>
         </w:tc>
@@ -19280,7 +19692,7 @@
               <w:rPr>
                 <w:sz w:val="16"/>
               </w:rPr>
-              <w:t>nenhuma</w:t>
+              <w:t>SMOTE</w:t>
             </w:r>
           </w:p>
         </w:tc>
@@ -19301,7 +19713,7 @@
               <w:rPr>
                 <w:sz w:val="16"/>
               </w:rPr>
-              <w:t>Gradient Boosting</w:t>
+              <w:t>AdaBoost</w:t>
             </w:r>
           </w:p>
         </w:tc>
@@ -19320,7 +19732,7 @@
               <w:rPr>
                 <w:sz w:val="16"/>
               </w:rPr>
-              <w:t>subsample=0.8; n_estimators=200; max_depth=7; learning_rate=0.1</w:t>
+              <w:t>base_max_depth=5; learning_rate=1.0; n_estimators=300</w:t>
             </w:r>
           </w:p>
         </w:tc>
@@ -19359,6 +19771,63 @@
               <w:rPr>
                 <w:sz w:val="16"/>
               </w:rPr>
+              <w:t>Gradient Boosting</w:t>
+            </w:r>
+          </w:p>
+        </w:tc>
+        <w:tc>
+          <w:tcPr>
+            <w:tcW w:type="dxa" w:w="5669"/>
+          </w:tcPr>
+          <w:p>
+            <w:pPr>
+              <w:spacing w:after="20" w:line="240" w:lineRule="auto"/>
+              <w:jc w:val="center"/>
+            </w:pPr>
+            <w:r/>
+            <w:r>
+              <w:rPr>
+                <w:sz w:val="16"/>
+              </w:rPr>
+              <w:t>subsample=0.8; n_estimators=200; max_depth=7; learning_rate=0.1</w:t>
+            </w:r>
+          </w:p>
+        </w:tc>
+        <w:tc>
+          <w:tcPr>
+            <w:tcW w:type="dxa" w:w="1701"/>
+          </w:tcPr>
+          <w:p>
+            <w:pPr>
+              <w:spacing w:after="20" w:line="240" w:lineRule="auto"/>
+              <w:jc w:val="center"/>
+            </w:pPr>
+            <w:r/>
+            <w:r>
+              <w:rPr>
+                <w:sz w:val="16"/>
+              </w:rPr>
+              <w:t>nenhuma</w:t>
+            </w:r>
+          </w:p>
+        </w:tc>
+      </w:tr>
+      <w:tr>
+        <w:tc>
+          <w:tcPr>
+            <w:tcW w:type="dxa" w:w="1701"/>
+            <w:shd w:val="clear" w:color="auto" w:fill="F2F2F2"/>
+          </w:tcPr>
+          <w:p>
+            <w:pPr>
+              <w:spacing w:after="20" w:line="240" w:lineRule="auto"/>
+              <w:jc w:val="left"/>
+            </w:pPr>
+            <w:r/>
+            <w:r>
+              <w:rPr>
+                <w:sz w:val="16"/>
+              </w:rPr>
               <w:t>Extra Trees</w:t>
             </w:r>
           </w:p>
@@ -19366,6 +19835,7 @@
         <w:tc>
           <w:tcPr>
             <w:tcW w:type="dxa" w:w="5669"/>
+            <w:shd w:val="clear" w:color="auto" w:fill="F2F2F2"/>
           </w:tcPr>
           <w:p>
             <w:pPr>
@@ -19384,6 +19854,7 @@
         <w:tc>
           <w:tcPr>
             <w:tcW w:type="dxa" w:w="1701"/>
+            <w:shd w:val="clear" w:color="auto" w:fill="F2F2F2"/>
           </w:tcPr>
           <w:p>
             <w:pPr>
@@ -19519,7 +19990,43 @@
         <w:rPr>
           <w:b w:val="0"/>
         </w:rPr>
-        <w:t xml:space="preserve"> – afinação, avaliação e comparação dos nove modelos; importâncias e verificações de robustez.</w:t>
+        <w:t xml:space="preserve"> – afinação, avaliação e comparação dos dez modelos; importâncias e verificações de robustez.</w:t>
+      </w:r>
+    </w:p>
+    <w:p>
+      <w:pPr>
+        <w:pStyle w:val="ListBullet"/>
+        <w:spacing w:after="40"/>
+        <w:jc w:val="both"/>
+      </w:pPr>
+      <w:r>
+        <w:rPr>
+          <w:b w:val="0"/>
+        </w:rPr>
+      </w:r>
+      <w:r>
+        <w:rPr>
+          <w:b/>
+        </w:rPr>
+        <w:t>trabalho_aatd.py</w:t>
+      </w:r>
+      <w:r>
+        <w:rPr>
+          <w:b w:val="0"/>
+        </w:rPr>
+        <w:t xml:space="preserve"> – versão num único ficheiro de todo o pipeline (EDA, preparação, modelação, avaliação e submissão); </w:t>
+      </w:r>
+      <w:r>
+        <w:rPr>
+          <w:b/>
+        </w:rPr>
+        <w:t>overfit_check.py</w:t>
+      </w:r>
+      <w:r>
+        <w:rPr>
+          <w:b w:val="0"/>
+        </w:rPr>
+        <w:t xml:space="preserve"> – verificação de sobreajuste.</w:t>
       </w:r>
     </w:p>
     <w:p>

</xml_diff>

<commit_message>
Rebuild AATD report with SVM, K-Means and course notebooks
Co-Authored-By: Claude Sonnet 5.5 <noreply@anthropic.com>
Claude-Session: https://claude.ai/code/session_0147qv6WZvFHh5tRnNYyMkq8
</commit_message>
<xml_diff>
--- a/AATD_entrega/Relatorio_AATD.docx
+++ b/AATD_entrega/Relatorio_AATD.docx
@@ -251,7 +251,7 @@
         </w:rPr>
         <w:t>2.5 Avaliação (Evaluation)</w:t>
         <w:tab/>
-        <w:t>20</w:t>
+        <w:t>21</w:t>
       </w:r>
     </w:p>
     <w:p>
@@ -268,7 +268,7 @@
         </w:rPr>
         <w:t>3. Resultados</w:t>
         <w:tab/>
-        <w:t>21</w:t>
+        <w:t>22</w:t>
       </w:r>
     </w:p>
     <w:p>
@@ -285,7 +285,7 @@
         </w:rPr>
         <w:t>3.1 Comparação dos modelos</w:t>
         <w:tab/>
-        <w:t>21</w:t>
+        <w:t>22</w:t>
       </w:r>
     </w:p>
     <w:p>
@@ -302,7 +302,7 @@
         </w:rPr>
         <w:t>3.2 Análise por modelo</w:t>
         <w:tab/>
-        <w:t>22</w:t>
+        <w:t>24</w:t>
       </w:r>
     </w:p>
     <w:p>
@@ -319,7 +319,7 @@
         </w:rPr>
         <w:t>3.3 Importância das variáveis</w:t>
         <w:tab/>
-        <w:t>25</w:t>
+        <w:t>28</w:t>
       </w:r>
     </w:p>
     <w:p>
@@ -336,7 +336,7 @@
         </w:rPr>
         <w:t>3.4 Verificações de robustez</w:t>
         <w:tab/>
-        <w:t>27</w:t>
+        <w:t>29</w:t>
       </w:r>
     </w:p>
     <w:p>
@@ -353,7 +353,7 @@
         </w:rPr>
         <w:t>3.5 Modelo final e submissão</w:t>
         <w:tab/>
-        <w:t>28</w:t>
+        <w:t>30</w:t>
       </w:r>
     </w:p>
     <w:p>
@@ -370,7 +370,7 @@
         </w:rPr>
         <w:t>4. Conclusão</w:t>
         <w:tab/>
-        <w:t>29</w:t>
+        <w:t>31</w:t>
       </w:r>
     </w:p>
     <w:p>
@@ -387,7 +387,7 @@
         </w:rPr>
         <w:t>Referências</w:t>
         <w:tab/>
-        <w:t>29</w:t>
+        <w:t>31</w:t>
       </w:r>
     </w:p>
     <w:p>
@@ -404,7 +404,7 @@
         </w:rPr>
         <w:t>Anexo A – Hiperparâmetros e grelhas de pesquisa</w:t>
         <w:tab/>
-        <w:t>31</w:t>
+        <w:t>33</w:t>
       </w:r>
     </w:p>
     <w:p>
@@ -421,7 +421,7 @@
         </w:rPr>
         <w:t>Anexo B – Estrutura do código e reprodutibilidade</w:t>
         <w:tab/>
-        <w:t>31</w:t>
+        <w:t>34</w:t>
       </w:r>
     </w:p>
     <w:p>
@@ -459,7 +459,7 @@
           <w:b w:val="0"/>
           <w:i w:val="0"/>
         </w:rPr>
-        <w:t xml:space="preserve"> Este trabalho aborda um problema de classificação binária em que se pretende prever se um produto, vendido em diversos estabelecimentos, se encontra com desconto (y = 1) ou sem desconto (y = 0), a partir de 17 variáveis discretas (d) e 9 variáveis contínuas (x). Seguiu-se a metodologia CRISP-DM. A análise exploratória dos 3 676 registos de treino revelou um desequilíbrio moderado de classes (20,6% de produtos com desconto), distribuições assimétricas em várias variáveis contínuas, 49 valores em falta em x9 – todos associados a y = 0 – e 170 registos duplicados com etiqueta consistente. Na preparação dos dados trataram-se os valores em falta (mediana e indicador de ausência), avaliaram-se os valores atípicos, o desequilíbrio (sobreamostragem aleatória, SMOTE, subamostragem e ponderação de classes) e a redundância entre variáveis, e o conjunto de treino foi dividido em treino interno (80%) e validação (20%), com validação cruzada estratificada de 5 folds no treino interno. Foram afinados e comparados dez algoritmos – KNN, árvore de decisão, regressão logística, Naive Bayes, MLP, Random Forest, Bagging, AdaBoost, Gradient Boosting e Extra Trees – através de accuracy, precision, recall e F-measure. Os métodos baseados em conjuntos de árvores foram claramente superiores: obtiveram entre 94,6% e 95,9% de accuracy na validação, contra 88,7% do KNN, 80,6% da regressão logística, 78,9% do MLP e 53,3% do Naive Bayes. O modelo selecionado por validação cruzada (AdaBoost, accuracy de 95,1% em CV) foi reajustado com todos os dados de treino e utilizado para gerar o ficheiro de submissão. As diferenças entre os cinco melhores modelos são, no entanto, inferiores ao erro-padrão das estimativas, pelo que não se pode afirmar que um deles seja superior aos restantes.</w:t>
+        <w:t xml:space="preserve"> Este trabalho aborda um problema de classificação binária em que se pretende prever se um produto, vendido em diversos estabelecimentos, se encontra com desconto (y = 1) ou sem desconto (y = 0), a partir de 17 variáveis discretas (d) e 9 variáveis contínuas (x). Seguiu-se a metodologia CRISP-DM. A análise exploratória dos 3 676 registos de treino revelou um desequilíbrio moderado de classes (20,6% de produtos com desconto), distribuições assimétricas em várias variáveis contínuas, 49 valores em falta em x9 – todos associados a y = 0 – e 170 registos duplicados com etiqueta consistente. Na preparação dos dados trataram-se os valores em falta (mediana e indicador de ausência), avaliaram-se os valores atípicos, o desequilíbrio (sobreamostragem aleatória, SMOTE, subamostragem e ponderação de classes) e a redundância entre variáveis, e o conjunto de treino foi dividido em treino interno (80%) e validação (20%), com validação cruzada estratificada de 5 folds no treino interno. Foram afinados e comparados doze algoritmos – KNN, K-Means (como classificador), árvore de decisão, regressão logística, SVM, Naive Bayes, MLP, Random Forest, Bagging, AdaBoost, Gradient Boosting e Extra Trees – através de accuracy, precision, recall e F-measure. Os métodos baseados em conjuntos de árvores foram claramente superiores: obtiveram entre 94,6% e 95,9% de accuracy na validação, contra 88,7% do KNN, 87,9% do SVM, 80,6% da regressão logística, 79,9% do K-Means, 78,9% do MLP e 53,3% do Naive Bayes. O modelo selecionado por validação cruzada (AdaBoost, accuracy de 95,1% em CV) foi reajustado com todos os dados de treino e utilizado para gerar o ficheiro de submissão. As diferenças entre os cinco melhores modelos são, no entanto, inferiores ao erro-padrão das estimativas, pelo que não se pode afirmar que um deles seja superior aos restantes.</w:t>
       </w:r>
     </w:p>
     <w:p>
@@ -512,7 +512,7 @@
           <w:b w:val="0"/>
           <w:i w:val="0"/>
         </w:rPr>
-        <w:t xml:space="preserve"> This work addresses a binary classification problem: predicting whether a product sold in several establishments is on sale (y = 1) or not (y = 0), using 17 discrete (d) and 9 continuous (x) variables. The CRISP-DM process was followed. Exploratory analysis of the 3,676 training records showed a moderate class imbalance (20.6% positives), skewed continuous variables, 49 missing values in x9 – all of them with y = 0 – and 170 duplicated records with consistent labels. Data preparation covered missing values (median imputation plus a missingness indicator), outliers, class imbalance (random oversampling, SMOTE, undersampling and class weights) and feature redundancy, and the training data were split into an inner training set (80%) and a hold-out validation set (20%), with stratified 5-fold cross-validation on the former. Ten algorithms – KNN, decision tree, logistic regression, Naive Bayes, MLP, Random Forest, Bagging, AdaBoost, Gradient Boosting and Extra Trees – were tuned and compared using accuracy, precision, recall and F-measure. Tree ensembles clearly outperformed the other families, reaching 94.6%–95.9% validation accuracy versus 88.7% for KNN, 80.6% for logistic regression, 78.9% for the MLP and 53.3% for Naive Bayes. The model selected by cross-validation (AdaBoost, 95.1% CV accuracy) was refitted on the full training set to produce the submission file. Differences among the five best models are smaller than the standard error of the estimates, so no single one can be declared superior.</w:t>
+        <w:t xml:space="preserve"> This work addresses a binary classification problem: predicting whether a product sold in several establishments is on sale (y = 1) or not (y = 0), using 17 discrete (d) and 9 continuous (x) variables. The CRISP-DM process was followed. Exploratory analysis of the 3,676 training records showed a moderate class imbalance (20.6% positives), skewed continuous variables, 49 missing values in x9 – all of them with y = 0 – and 170 duplicated records with consistent labels. Data preparation covered missing values (median imputation plus a missingness indicator), outliers, class imbalance (random oversampling, SMOTE, undersampling and class weights) and feature redundancy, and the training data were split into an inner training set (80%) and a hold-out validation set (20%), with stratified 5-fold cross-validation on the former. Twelve algorithms – KNN, K-Means (used as a classifier), decision tree, logistic regression, SVM, Naive Bayes, MLP, Random Forest, Bagging, AdaBoost, Gradient Boosting and Extra Trees – were tuned and compared using accuracy, precision, recall and F-measure. Tree ensembles clearly outperformed the other families, reaching 94.6%–95.9% validation accuracy versus 88.7% for KNN, 87.9% for the SVM, 80.6% for logistic regression, 79.9% for K-Means, 78.9% for the MLP and 53.3% for Naive Bayes. The model selected by cross-validation (AdaBoost, 95.1% CV accuracy) was refitted on the full training set to produce the submission file. Differences among the five best models are smaller than the standard error of the estimates, so no single one can be declared superior.</w:t>
       </w:r>
     </w:p>
     <w:p>
@@ -660,7 +660,7 @@
         <w:rPr>
           <w:b w:val="0"/>
         </w:rPr>
-        <w:t>Treinar, afinar e comparar KNN, árvores de decisão, regressão logística, Naive Bayes, redes neuronais (MLP), Random Forest, Bagging e Boosting, com uma tabela comparativa de accuracy, precision, recall e F-measure.</w:t>
+        <w:t>Treinar, afinar e comparar KNN, K-Means, árvores de decisão, regressão logística, SVM, Naive Bayes, redes neuronais (MLP), Random Forest, Bagging e Boosting, com uma tabela comparativa de accuracy, precision, recall e F-measure.</w:t>
       </w:r>
     </w:p>
     <w:p>
@@ -8042,7 +8042,35 @@
           <w:b w:val="0"/>
           <w:i w:val="0"/>
         </w:rPr>
-        <w:t>, enquanto entre os registos com x9 observado a taxa de y = 1 é de 20,8%. Os valores em falta não são, portanto, completamente aleatórios (não são MCAR): a ausência é informativa. Por esse motivo, para além de imputar, acrescenta-se uma variável indicadora de ausência. Compararam-se três imputações – mediana, média e KNN (k = 5) – com uma árvore de decisão e uma Random Forest (Tabela 4). As diferenças são desprezáveis (a accuracy da Random Forest varia entre 0,937 e 0,939), pelo que se adotou a imputação pela mediana, mais robusta a assimetrias e mais simples, complementada pelo indicador. O indicador aumentou a accuracy da Random Forest de 0,9367 para 0,9381 e a F-measure de 0,840 para 0,845, um ganho pequeno mas coerente com a evidência anterior.</w:t>
+        <w:t xml:space="preserve">, enquanto entre os registos com x9 observado a taxa de y = 1 é de 20,8%. Os valores em falta não são, portanto, completamente aleatórios (não são MCAR): a ausência é informativa. Por esse motivo, para além de imputar, acrescenta-se uma variável indicadora de ausência. Compararam-se três imputações – mediana, média e KNN (k = 5) – com uma árvore de decisão e uma Random Forest (Tabela 4). Seguindo o plano de pré-processamento do notebook «AATD – PreProc», comparou-se ainda a estratégia (1) de </w:t>
+      </w:r>
+      <w:r>
+        <w:rPr>
+          <w:b/>
+          <w:i w:val="0"/>
+        </w:rPr>
+        <w:t>remover</w:t>
+      </w:r>
+      <w:r>
+        <w:rPr>
+          <w:b w:val="0"/>
+          <w:i w:val="0"/>
+        </w:rPr>
+        <w:t xml:space="preserve"> os 49 registos com a estratégia (2) de </w:t>
+      </w:r>
+      <w:r>
+        <w:rPr>
+          <w:b/>
+          <w:i w:val="0"/>
+        </w:rPr>
+        <w:t>imputar</w:t>
+      </w:r>
+      <w:r>
+        <w:rPr>
+          <w:b w:val="0"/>
+          <w:i w:val="0"/>
+        </w:rPr>
+        <w:t xml:space="preserve"> a mediana (validação cruzada de 5 folds; em ambas o fold de teste é completo, porque task.csv também tem registos com x9 em falta): a Random Forest obtém accuracy de 0,9456 removendo as linhas e de 0,9513 imputando, e a árvore de decisão 0,8441 e 0,8488, respetivamente. A remoção perde informação e, como todos os 49 registos têm y = 0, elimina precisamente os casos que mostram que x9 em falta implica ausência de desconto. As diferenças são desprezáveis (a accuracy da Random Forest varia entre 0,937 e 0,939), pelo que se adotou a imputação pela mediana, mais robusta a assimetrias e mais simples, complementada pelo indicador. O indicador aumentou a accuracy da Random Forest de 0,9367 para 0,9381 e a F-measure de 0,840 para 0,845, um ganho pequeno mas coerente com a evidência anterior.</w:t>
       </w:r>
     </w:p>
     <w:p>
@@ -13523,6 +13551,206 @@
     </w:p>
     <w:p>
       <w:pPr>
+        <w:pStyle w:val="Heading3"/>
+      </w:pPr>
+      <w:r>
+        <w:t>2.3.7 Plano de pré-processamento: resumo</w:t>
+      </w:r>
+    </w:p>
+    <w:p>
+      <w:pPr>
+        <w:jc w:val="both"/>
+      </w:pPr>
+      <w:r>
+        <w:rPr>
+          <w:b w:val="0"/>
+          <w:i w:val="0"/>
+        </w:rPr>
+        <w:t>O notebook «AATD – PreProc» propõe sete perguntas que resumem as decisões desta fase; as respostas, com base na análise anterior, são:</w:t>
+      </w:r>
+    </w:p>
+    <w:p>
+      <w:pPr>
+        <w:pStyle w:val="ListBullet"/>
+        <w:spacing w:after="40"/>
+        <w:jc w:val="both"/>
+      </w:pPr>
+      <w:r>
+        <w:rPr>
+          <w:b w:val="0"/>
+        </w:rPr>
+      </w:r>
+      <w:r>
+        <w:rPr>
+          <w:b/>
+        </w:rPr>
+        <w:t>Variáveis com valores em falta:</w:t>
+      </w:r>
+      <w:r>
+        <w:rPr>
+          <w:b w:val="0"/>
+        </w:rPr>
+        <w:t xml:space="preserve"> apenas x9 (49 registos no treino, 1,33%; 30 em task.csv); todos os registos de treino com x9 em falta têm y = 0.</w:t>
+      </w:r>
+    </w:p>
+    <w:p>
+      <w:pPr>
+        <w:pStyle w:val="ListBullet"/>
+        <w:spacing w:after="40"/>
+        <w:jc w:val="both"/>
+      </w:pPr>
+      <w:r>
+        <w:rPr>
+          <w:b w:val="0"/>
+        </w:rPr>
+      </w:r>
+      <w:r>
+        <w:rPr>
+          <w:b/>
+        </w:rPr>
+        <w:t>Tratamento dos valores em falta:</w:t>
+      </w:r>
+      <w:r>
+        <w:rPr>
+          <w:b w:val="0"/>
+        </w:rPr>
+        <w:t xml:space="preserve"> mediana do treino (calculada dentro de cada fold) mais indicador de ausência; a remoção das linhas foi testada e não melhora o resultado.</w:t>
+      </w:r>
+    </w:p>
+    <w:p>
+      <w:pPr>
+        <w:pStyle w:val="ListBullet"/>
+        <w:spacing w:after="40"/>
+        <w:jc w:val="both"/>
+      </w:pPr>
+      <w:r>
+        <w:rPr>
+          <w:b w:val="0"/>
+        </w:rPr>
+      </w:r>
+      <w:r>
+        <w:rPr>
+          <w:b/>
+        </w:rPr>
+        <w:t>Variáveis com outliers (Tukey):</w:t>
+      </w:r>
+      <w:r>
+        <w:rPr>
+          <w:b w:val="0"/>
+        </w:rPr>
+        <w:t xml:space="preserve"> x3 (61), x4 (377), x5 (374), x7 (103) e x8 (55); x1, x2, x6 e x9 não têm.</w:t>
+      </w:r>
+    </w:p>
+    <w:p>
+      <w:pPr>
+        <w:pStyle w:val="ListBullet"/>
+        <w:spacing w:after="40"/>
+        <w:jc w:val="both"/>
+      </w:pPr>
+      <w:r>
+        <w:rPr>
+          <w:b w:val="0"/>
+        </w:rPr>
+      </w:r>
+      <w:r>
+        <w:rPr>
+          <w:b/>
+        </w:rPr>
+        <w:t>Remover, manter ou investigar:</w:t>
+      </w:r>
+      <w:r>
+        <w:rPr>
+          <w:b w:val="0"/>
+        </w:rPr>
+        <w:t xml:space="preserve"> investigaram-se e </w:t>
+      </w:r>
+      <w:r>
+        <w:rPr>
+          <w:b/>
+        </w:rPr>
+        <w:t>mantiveram-se</w:t>
+      </w:r>
+      <w:r>
+        <w:rPr>
+          <w:b w:val="0"/>
+        </w:rPr>
+        <w:t>. x5 é muito assimétrica com valores grandes genuínos; x4 é quase constante (IQR = 0), pelo que todo o valor diferente de 1 é assinalado, embora 2 e 3 sejam categorias legítimas; os modelos de árvores são insensíveis a estes valores e a winsorização não melhorou KNN nem Naive Bayes.</w:t>
+      </w:r>
+    </w:p>
+    <w:p>
+      <w:pPr>
+        <w:pStyle w:val="ListBullet"/>
+        <w:spacing w:after="40"/>
+        <w:jc w:val="both"/>
+      </w:pPr>
+      <w:r>
+        <w:rPr>
+          <w:b w:val="0"/>
+        </w:rPr>
+      </w:r>
+      <w:r>
+        <w:rPr>
+          <w:b/>
+        </w:rPr>
+        <w:t>Variáveis com variabilidade muito baixa:</w:t>
+      </w:r>
+      <w:r>
+        <w:rPr>
+          <w:b w:val="0"/>
+        </w:rPr>
+        <w:t xml:space="preserve"> x4 (89,7% dos registos valem 1) e as variáveis binárias d3, d7, d8, d12, d10, d15, d16 e d17, com mais de 97% de zeros (a mais extrema é d7, com 98,5%). Foram mantidas.</w:t>
+      </w:r>
+    </w:p>
+    <w:p>
+      <w:pPr>
+        <w:pStyle w:val="ListBullet"/>
+        <w:spacing w:after="40"/>
+        <w:jc w:val="both"/>
+      </w:pPr>
+      <w:r>
+        <w:rPr>
+          <w:b w:val="0"/>
+        </w:rPr>
+      </w:r>
+      <w:r>
+        <w:rPr>
+          <w:b/>
+        </w:rPr>
+        <w:t>Categorias com frequência muito baixa:</w:t>
+      </w:r>
+      <w:r>
+        <w:rPr>
+          <w:b w:val="0"/>
+        </w:rPr>
+        <w:t xml:space="preserve"> as mesmas oito variáveis d têm prevalência inferior a 3% (de 1,5% em d7 a 2,8% em d16). Não foram agregadas, por serem indicadores binários independentes.</w:t>
+      </w:r>
+    </w:p>
+    <w:p>
+      <w:pPr>
+        <w:pStyle w:val="ListBullet"/>
+        <w:spacing w:after="40"/>
+        <w:jc w:val="both"/>
+      </w:pPr>
+      <w:r>
+        <w:rPr>
+          <w:b w:val="0"/>
+        </w:rPr>
+      </w:r>
+      <w:r>
+        <w:rPr>
+          <w:b/>
+        </w:rPr>
+        <w:t>Conjunto entregue à modelação:</w:t>
+      </w:r>
+      <w:r>
+        <w:rPr>
+          <w:b w:val="0"/>
+        </w:rPr>
+        <w:t xml:space="preserve"> 3 676 registos, as 26 variáveis preditoras (17 d e 9 x) mais o indicador x9_em_falta, sem a coluna i, com valores em falta imputados, outliers inalterados e padronização apenas nos modelos baseados em distâncias, dividido em treino interno (80%) e validação (20%) estratificados.</w:t>
+      </w:r>
+    </w:p>
+    <w:p>
+      <w:pPr>
         <w:pStyle w:val="Heading2"/>
       </w:pPr>
       <w:r>
@@ -13546,7 +13774,7 @@
           <w:b w:val="0"/>
           <w:i w:val="0"/>
         </w:rPr>
-        <w:t>Compararam-se dez algoritmos de famílias distintas (Tabela 11). Todos partem do mesmo pré-processamento: imputação pela mediana com indicador de ausência de x9; padronização apenas nos modelos sensíveis à escala (KNN, Naive Bayes e MLP); e reamostragem opcional por SMOTE, escolhida por validação cruzada.</w:t>
+        <w:t>Compararam-se doze algoritmos de famílias distintas (Tabela 11). Todos partem do mesmo pré-processamento: imputação pela mediana com indicador de ausência de x9; padronização apenas nos modelos sensíveis à escala (KNN, Naive Bayes e MLP); e reamostragem opcional por SMOTE, escolhida por validação cruzada.</w:t>
       </w:r>
     </w:p>
     <w:p>
@@ -13807,6 +14035,121 @@
                 <w:sz w:val="17"/>
               </w:rPr>
               <w:t>C (inverso da regularização)</w:t>
+            </w:r>
+          </w:p>
+        </w:tc>
+      </w:tr>
+      <w:tr>
+        <w:tc>
+          <w:tcPr>
+            <w:tcW w:type="dxa" w:w="1701"/>
+            <w:shd w:val="clear" w:color="auto" w:fill="F2F2F2"/>
+          </w:tcPr>
+          <w:p>
+            <w:pPr>
+              <w:spacing w:after="20" w:line="240" w:lineRule="auto"/>
+              <w:jc w:val="left"/>
+            </w:pPr>
+            <w:r/>
+            <w:r>
+              <w:rPr>
+                <w:sz w:val="17"/>
+              </w:rPr>
+              <w:t>K-Means (classificador)</w:t>
+            </w:r>
+          </w:p>
+        </w:tc>
+        <w:tc>
+          <w:tcPr>
+            <w:tcW w:type="dxa" w:w="4819"/>
+            <w:shd w:val="clear" w:color="auto" w:fill="F2F2F2"/>
+          </w:tcPr>
+          <w:p>
+            <w:pPr>
+              <w:spacing w:after="20" w:line="240" w:lineRule="auto"/>
+              <w:jc w:val="center"/>
+            </w:pPr>
+            <w:r/>
+            <w:r>
+              <w:rPr>
+                <w:sz w:val="17"/>
+              </w:rPr>
+              <w:t>Agrupamento não supervisionado em k clusters; cada cluster recebe a classe maioritária dos exemplos de treino que o compõem (MacQueen, 1967)</w:t>
+            </w:r>
+          </w:p>
+        </w:tc>
+        <w:tc>
+          <w:tcPr>
+            <w:tcW w:type="dxa" w:w="2551"/>
+            <w:shd w:val="clear" w:color="auto" w:fill="F2F2F2"/>
+          </w:tcPr>
+          <w:p>
+            <w:pPr>
+              <w:spacing w:after="20" w:line="240" w:lineRule="auto"/>
+              <w:jc w:val="center"/>
+            </w:pPr>
+            <w:r/>
+            <w:r>
+              <w:rPr>
+                <w:sz w:val="17"/>
+              </w:rPr>
+              <w:t>n.º de clusters</w:t>
+            </w:r>
+          </w:p>
+        </w:tc>
+      </w:tr>
+      <w:tr>
+        <w:tc>
+          <w:tcPr>
+            <w:tcW w:type="dxa" w:w="1701"/>
+          </w:tcPr>
+          <w:p>
+            <w:pPr>
+              <w:spacing w:after="20" w:line="240" w:lineRule="auto"/>
+              <w:jc w:val="left"/>
+            </w:pPr>
+            <w:r/>
+            <w:r>
+              <w:rPr>
+                <w:sz w:val="17"/>
+              </w:rPr>
+              <w:t>SVM</w:t>
+            </w:r>
+          </w:p>
+        </w:tc>
+        <w:tc>
+          <w:tcPr>
+            <w:tcW w:type="dxa" w:w="4819"/>
+          </w:tcPr>
+          <w:p>
+            <w:pPr>
+              <w:spacing w:after="20" w:line="240" w:lineRule="auto"/>
+              <w:jc w:val="center"/>
+            </w:pPr>
+            <w:r/>
+            <w:r>
+              <w:rPr>
+                <w:sz w:val="17"/>
+              </w:rPr>
+              <w:t>Hiperplano de margem máxima com núcleo RBF (Cortes &amp; Vapnik, 1995)</w:t>
+            </w:r>
+          </w:p>
+        </w:tc>
+        <w:tc>
+          <w:tcPr>
+            <w:tcW w:type="dxa" w:w="2551"/>
+          </w:tcPr>
+          <w:p>
+            <w:pPr>
+              <w:spacing w:after="20" w:line="240" w:lineRule="auto"/>
+              <w:jc w:val="center"/>
+            </w:pPr>
+            <w:r/>
+            <w:r>
+              <w:rPr>
+                <w:sz w:val="17"/>
+              </w:rPr>
+              <w:t>C, gamma</w:t>
             </w:r>
           </w:p>
         </w:tc>
@@ -14244,7 +14587,7 @@
           <w:b w:val="0"/>
           <w:i w:val="0"/>
         </w:rPr>
-        <w:t xml:space="preserve"> e a </w:t>
+        <w:t xml:space="preserve">, a </w:t>
       </w:r>
       <w:r>
         <w:rPr>
@@ -14258,7 +14601,49 @@
           <w:b w:val="0"/>
           <w:i w:val="0"/>
         </w:rPr>
-        <w:t xml:space="preserve"> não estavam na lista pedida: o primeiro foi incluído por ser uma variante de Random Forest muito competitiva em dados de dimensão reduzida, e a segunda como referência linear simples e interpretável. Os resultados dos oito algoritmos pedidos podem ser lidos sem eles. Considerou-se o conjunto Random Forest, Bagging, AdaBoost e Gradient Boosting como as famílias de «bagging» e «boosting».</w:t>
+        <w:t xml:space="preserve">, o </w:t>
+      </w:r>
+      <w:r>
+        <w:rPr>
+          <w:b/>
+          <w:i w:val="0"/>
+        </w:rPr>
+        <w:t>SVM</w:t>
+      </w:r>
+      <w:r>
+        <w:rPr>
+          <w:b w:val="0"/>
+          <w:i w:val="0"/>
+        </w:rPr>
+        <w:t xml:space="preserve"> e o </w:t>
+      </w:r>
+      <w:r>
+        <w:rPr>
+          <w:b/>
+          <w:i w:val="0"/>
+        </w:rPr>
+        <w:t>K-Means</w:t>
+      </w:r>
+      <w:r>
+        <w:rPr>
+          <w:b w:val="0"/>
+          <w:i w:val="0"/>
+        </w:rPr>
+        <w:t xml:space="preserve"> não estavam na lista pedida: o primeiro foi incluído por ser uma variante de Random Forest muito competitiva em dados de dimensão reduzida, a segunda como referência linear simples e interpretável, e os dois últimos por constarem dos exemplos das aulas (notebooks AATD – SVM e AATD – K-Means). O K-Means é um método não supervisionado; usa-se aqui como classificador atribuindo a cada cluster a classe maioritária do </w:t>
+      </w:r>
+      <w:r>
+        <w:rPr>
+          <w:b/>
+          <w:i w:val="0"/>
+        </w:rPr>
+        <w:t>treino</w:t>
+      </w:r>
+      <w:r>
+        <w:rPr>
+          <w:b w:val="0"/>
+          <w:i w:val="0"/>
+        </w:rPr>
+        <w:t xml:space="preserve"> (o notebook das aulas usava y_test, o que constitui fuga de informação). Os resultados dos oito algoritmos pedidos podem ser lidos sem os restantes. Considerou-se o conjunto Random Forest, Bagging, AdaBoost e Gradient Boosting como as famílias de «bagging» e «boosting».</w:t>
       </w:r>
     </w:p>
     <w:p>
@@ -14292,7 +14677,27 @@
           <w:b w:val="0"/>
           <w:i w:val="0"/>
         </w:rPr>
-        <w:t xml:space="preserve"> no treino interno (a métrica da competição). O Gradient Boosting, mais caro, foi afinado com RandomizedSearchCV (12 combinações). Em todos os casos a escolha entre «sem reamostragem» e SMOTE faz parte da grelha. Após a escolha da melhor combinação, o modelo é reajustado em todo o treino interno e avaliado (i) por validação cruzada, reportando média e desvio-padrão e (ii) no conjunto de validação hold-out, reportando accuracy, precision, recall, F-measure, AUC-ROC e precisão média (área sob a curva precision-recall).</w:t>
+        <w:t xml:space="preserve"> no treino interno (a métrica da competição). O Gradient Boosting, mais caro, foi afinado com RandomizedSearchCV (12 combinações). Em todos os casos a escolha entre «sem reamostragem» e SMOTE faz parte da grelha. O SVM foi afinado apenas com núcleo RBF (o caso linear é coberto pela regressão logística) e, por não produzir probabilidades por omissão, usa a pontuação de decisão para o cálculo da AUC e das curvas ROC/PR. Após a escolha da melhor combinação, o modelo é reajustado em todo o treino interno e avaliado (i) por validação cruzada, reportando média e desvio-padrão e (ii) no conjunto de validação hold-out, reportando accuracy, precision, recall, F-measure, AUC-ROC e precisão média (área sob a curva precision-recall).</w:t>
+      </w:r>
+    </w:p>
+    <w:p>
+      <w:pPr>
+        <w:pStyle w:val="Heading3"/>
+      </w:pPr>
+      <w:r>
+        <w:t>2.4.3 Implementação: notebooks das aulas</w:t>
+      </w:r>
+    </w:p>
+    <w:p>
+      <w:pPr>
+        <w:jc w:val="both"/>
+      </w:pPr>
+      <w:r>
+        <w:rPr>
+          <w:b w:val="0"/>
+          <w:i w:val="0"/>
+        </w:rPr>
+        <w:t>O código foi construído a partir dos notebooks das aulas (AATD – DT, kNN, NB, SVM e K-Means), que seguem sempre o mesmo guião: Import Packages → Load Data → Create Train and Test Datasets → Train Model → Evaluate Model → Predict New Example. Cada um foi reproduzido com os dados do projeto (pasta notebooks/), mantendo os parâmetros usados nas aulas (kNN com k = 4, árvore e SVM por omissão, Naive Bayes Gaussiano, K-Means com k = 2) e a mesma divisão estratificada de 80% / 20% do relatório, acrescentando o que os dados exigem (imputação da mediana com indicador de ausência e, nos modelos baseados em distâncias, padronização, ambas ajustadas só no treino) e corrigindo dois erros dos originais: a accuracy era impressa como «0,97%» em vez de 97% e a correspondência cluster–classe do K-Means usava y_test. O notebook AATD – PreProc foi completado com a comparação remover/imputar e as respostas ao plano de pré-processamento (secção 2.3.7). O pipeline completo (afinação, validação cruzada e comparação) está no ficheiro trabalho_aatd.py.</w:t>
       </w:r>
     </w:p>
     <w:p>
@@ -15669,7 +16074,7 @@
               <w:rPr>
                 <w:sz w:val="17"/>
               </w:rPr>
-              <w:t>MLP</w:t>
+              <w:t>SVM</w:t>
             </w:r>
           </w:p>
         </w:tc>
@@ -15688,7 +16093,7 @@
               <w:rPr>
                 <w:sz w:val="17"/>
               </w:rPr>
-              <w:t>0,8639 ± 0,0182</w:t>
+              <w:t>0,8656 ± 0,0158</w:t>
             </w:r>
           </w:p>
         </w:tc>
@@ -15707,7 +16112,7 @@
               <w:rPr>
                 <w:sz w:val="17"/>
               </w:rPr>
-              <w:t>0,693</w:t>
+              <w:t>0,656</w:t>
             </w:r>
           </w:p>
         </w:tc>
@@ -15726,7 +16131,7 @@
               <w:rPr>
                 <w:sz w:val="17"/>
               </w:rPr>
-              <w:t>0,789</w:t>
+              <w:t>0,879</w:t>
             </w:r>
           </w:p>
         </w:tc>
@@ -15745,7 +16150,7 @@
               <w:rPr>
                 <w:sz w:val="17"/>
               </w:rPr>
-              <w:t>0,491</w:t>
+              <w:t>0,738</w:t>
             </w:r>
           </w:p>
         </w:tc>
@@ -15764,7 +16169,7 @@
               <w:rPr>
                 <w:sz w:val="17"/>
               </w:rPr>
-              <w:t>0,748</w:t>
+              <w:t>0,636</w:t>
             </w:r>
           </w:p>
         </w:tc>
@@ -15783,7 +16188,7 @@
               <w:rPr>
                 <w:sz w:val="17"/>
               </w:rPr>
-              <w:t>0,593</w:t>
+              <w:t>0,683</w:t>
             </w:r>
           </w:p>
         </w:tc>
@@ -15802,7 +16207,7 @@
               <w:rPr>
                 <w:sz w:val="17"/>
               </w:rPr>
-              <w:t>0,846</w:t>
+              <w:t>0,868</w:t>
             </w:r>
           </w:p>
         </w:tc>
@@ -15822,6 +16227,153 @@
               <w:rPr>
                 <w:sz w:val="17"/>
               </w:rPr>
+              <w:t>MLP</w:t>
+            </w:r>
+          </w:p>
+        </w:tc>
+        <w:tc>
+          <w:tcPr>
+            <w:tcW w:type="dxa" w:w="1134"/>
+          </w:tcPr>
+          <w:p>
+            <w:pPr>
+              <w:spacing w:after="20" w:line="240" w:lineRule="auto"/>
+              <w:jc w:val="center"/>
+            </w:pPr>
+            <w:r/>
+            <w:r>
+              <w:rPr>
+                <w:sz w:val="17"/>
+              </w:rPr>
+              <w:t>0,8639 ± 0,0182</w:t>
+            </w:r>
+          </w:p>
+        </w:tc>
+        <w:tc>
+          <w:tcPr>
+            <w:tcW w:type="dxa" w:w="1134"/>
+          </w:tcPr>
+          <w:p>
+            <w:pPr>
+              <w:spacing w:after="20" w:line="240" w:lineRule="auto"/>
+              <w:jc w:val="center"/>
+            </w:pPr>
+            <w:r/>
+            <w:r>
+              <w:rPr>
+                <w:sz w:val="17"/>
+              </w:rPr>
+              <w:t>0,693</w:t>
+            </w:r>
+          </w:p>
+        </w:tc>
+        <w:tc>
+          <w:tcPr>
+            <w:tcW w:type="dxa" w:w="1134"/>
+          </w:tcPr>
+          <w:p>
+            <w:pPr>
+              <w:spacing w:after="20" w:line="240" w:lineRule="auto"/>
+              <w:jc w:val="center"/>
+            </w:pPr>
+            <w:r/>
+            <w:r>
+              <w:rPr>
+                <w:sz w:val="17"/>
+              </w:rPr>
+              <w:t>0,789</w:t>
+            </w:r>
+          </w:p>
+        </w:tc>
+        <w:tc>
+          <w:tcPr>
+            <w:tcW w:type="dxa" w:w="1134"/>
+          </w:tcPr>
+          <w:p>
+            <w:pPr>
+              <w:spacing w:after="20" w:line="240" w:lineRule="auto"/>
+              <w:jc w:val="center"/>
+            </w:pPr>
+            <w:r/>
+            <w:r>
+              <w:rPr>
+                <w:sz w:val="17"/>
+              </w:rPr>
+              <w:t>0,491</w:t>
+            </w:r>
+          </w:p>
+        </w:tc>
+        <w:tc>
+          <w:tcPr>
+            <w:tcW w:type="dxa" w:w="1134"/>
+          </w:tcPr>
+          <w:p>
+            <w:pPr>
+              <w:spacing w:after="20" w:line="240" w:lineRule="auto"/>
+              <w:jc w:val="center"/>
+            </w:pPr>
+            <w:r/>
+            <w:r>
+              <w:rPr>
+                <w:sz w:val="17"/>
+              </w:rPr>
+              <w:t>0,748</w:t>
+            </w:r>
+          </w:p>
+        </w:tc>
+        <w:tc>
+          <w:tcPr>
+            <w:tcW w:type="dxa" w:w="1134"/>
+          </w:tcPr>
+          <w:p>
+            <w:pPr>
+              <w:spacing w:after="20" w:line="240" w:lineRule="auto"/>
+              <w:jc w:val="center"/>
+            </w:pPr>
+            <w:r/>
+            <w:r>
+              <w:rPr>
+                <w:sz w:val="17"/>
+              </w:rPr>
+              <w:t>0,593</w:t>
+            </w:r>
+          </w:p>
+        </w:tc>
+        <w:tc>
+          <w:tcPr>
+            <w:tcW w:type="dxa" w:w="1134"/>
+          </w:tcPr>
+          <w:p>
+            <w:pPr>
+              <w:spacing w:after="20" w:line="240" w:lineRule="auto"/>
+              <w:jc w:val="center"/>
+            </w:pPr>
+            <w:r/>
+            <w:r>
+              <w:rPr>
+                <w:sz w:val="17"/>
+              </w:rPr>
+              <w:t>0,846</w:t>
+            </w:r>
+          </w:p>
+        </w:tc>
+      </w:tr>
+      <w:tr>
+        <w:tc>
+          <w:tcPr>
+            <w:tcW w:type="dxa" w:w="1134"/>
+            <w:shd w:val="clear" w:color="auto" w:fill="F2F2F2"/>
+          </w:tcPr>
+          <w:p>
+            <w:pPr>
+              <w:spacing w:after="20" w:line="240" w:lineRule="auto"/>
+              <w:jc w:val="left"/>
+            </w:pPr>
+            <w:r/>
+            <w:r>
+              <w:rPr>
+                <w:sz w:val="17"/>
+              </w:rPr>
               <w:t>Regressão Logística</w:t>
             </w:r>
           </w:p>
@@ -15829,6 +16381,7 @@
         <w:tc>
           <w:tcPr>
             <w:tcW w:type="dxa" w:w="1134"/>
+            <w:shd w:val="clear" w:color="auto" w:fill="F2F2F2"/>
           </w:tcPr>
           <w:p>
             <w:pPr>
@@ -15847,6 +16400,7 @@
         <w:tc>
           <w:tcPr>
             <w:tcW w:type="dxa" w:w="1134"/>
+            <w:shd w:val="clear" w:color="auto" w:fill="F2F2F2"/>
           </w:tcPr>
           <w:p>
             <w:pPr>
@@ -15865,6 +16419,7 @@
         <w:tc>
           <w:tcPr>
             <w:tcW w:type="dxa" w:w="1134"/>
+            <w:shd w:val="clear" w:color="auto" w:fill="F2F2F2"/>
           </w:tcPr>
           <w:p>
             <w:pPr>
@@ -15883,6 +16438,7 @@
         <w:tc>
           <w:tcPr>
             <w:tcW w:type="dxa" w:w="1134"/>
+            <w:shd w:val="clear" w:color="auto" w:fill="F2F2F2"/>
           </w:tcPr>
           <w:p>
             <w:pPr>
@@ -15901,6 +16457,7 @@
         <w:tc>
           <w:tcPr>
             <w:tcW w:type="dxa" w:w="1134"/>
+            <w:shd w:val="clear" w:color="auto" w:fill="F2F2F2"/>
           </w:tcPr>
           <w:p>
             <w:pPr>
@@ -15919,6 +16476,7 @@
         <w:tc>
           <w:tcPr>
             <w:tcW w:type="dxa" w:w="1134"/>
+            <w:shd w:val="clear" w:color="auto" w:fill="F2F2F2"/>
           </w:tcPr>
           <w:p>
             <w:pPr>
@@ -15937,6 +16495,7 @@
         <w:tc>
           <w:tcPr>
             <w:tcW w:type="dxa" w:w="1134"/>
+            <w:shd w:val="clear" w:color="auto" w:fill="F2F2F2"/>
           </w:tcPr>
           <w:p>
             <w:pPr>
@@ -15949,6 +16508,152 @@
                 <w:sz w:val="17"/>
               </w:rPr>
               <w:t>0,762</w:t>
+            </w:r>
+          </w:p>
+        </w:tc>
+      </w:tr>
+      <w:tr>
+        <w:tc>
+          <w:tcPr>
+            <w:tcW w:type="dxa" w:w="1134"/>
+          </w:tcPr>
+          <w:p>
+            <w:pPr>
+              <w:spacing w:after="20" w:line="240" w:lineRule="auto"/>
+              <w:jc w:val="left"/>
+            </w:pPr>
+            <w:r/>
+            <w:r>
+              <w:rPr>
+                <w:sz w:val="17"/>
+              </w:rPr>
+              <w:t>K-Means (classificador)</w:t>
+            </w:r>
+          </w:p>
+        </w:tc>
+        <w:tc>
+          <w:tcPr>
+            <w:tcW w:type="dxa" w:w="1134"/>
+          </w:tcPr>
+          <w:p>
+            <w:pPr>
+              <w:spacing w:after="20" w:line="240" w:lineRule="auto"/>
+              <w:jc w:val="center"/>
+            </w:pPr>
+            <w:r/>
+            <w:r>
+              <w:rPr>
+                <w:sz w:val="17"/>
+              </w:rPr>
+              <w:t>0,8071 ± 0,0098</w:t>
+            </w:r>
+          </w:p>
+        </w:tc>
+        <w:tc>
+          <w:tcPr>
+            <w:tcW w:type="dxa" w:w="1134"/>
+          </w:tcPr>
+          <w:p>
+            <w:pPr>
+              <w:spacing w:after="20" w:line="240" w:lineRule="auto"/>
+              <w:jc w:val="center"/>
+            </w:pPr>
+            <w:r/>
+            <w:r>
+              <w:rPr>
+                <w:sz w:val="17"/>
+              </w:rPr>
+              <w:t>0,265</w:t>
+            </w:r>
+          </w:p>
+        </w:tc>
+        <w:tc>
+          <w:tcPr>
+            <w:tcW w:type="dxa" w:w="1134"/>
+          </w:tcPr>
+          <w:p>
+            <w:pPr>
+              <w:spacing w:after="20" w:line="240" w:lineRule="auto"/>
+              <w:jc w:val="center"/>
+            </w:pPr>
+            <w:r/>
+            <w:r>
+              <w:rPr>
+                <w:sz w:val="17"/>
+              </w:rPr>
+              <w:t>0,799</w:t>
+            </w:r>
+          </w:p>
+        </w:tc>
+        <w:tc>
+          <w:tcPr>
+            <w:tcW w:type="dxa" w:w="1134"/>
+          </w:tcPr>
+          <w:p>
+            <w:pPr>
+              <w:spacing w:after="20" w:line="240" w:lineRule="auto"/>
+              <w:jc w:val="center"/>
+            </w:pPr>
+            <w:r/>
+            <w:r>
+              <w:rPr>
+                <w:sz w:val="17"/>
+              </w:rPr>
+              <w:t>0,533</w:t>
+            </w:r>
+          </w:p>
+        </w:tc>
+        <w:tc>
+          <w:tcPr>
+            <w:tcW w:type="dxa" w:w="1134"/>
+          </w:tcPr>
+          <w:p>
+            <w:pPr>
+              <w:spacing w:after="20" w:line="240" w:lineRule="auto"/>
+              <w:jc w:val="center"/>
+            </w:pPr>
+            <w:r/>
+            <w:r>
+              <w:rPr>
+                <w:sz w:val="17"/>
+              </w:rPr>
+              <w:t>0,159</w:t>
+            </w:r>
+          </w:p>
+        </w:tc>
+        <w:tc>
+          <w:tcPr>
+            <w:tcW w:type="dxa" w:w="1134"/>
+          </w:tcPr>
+          <w:p>
+            <w:pPr>
+              <w:spacing w:after="20" w:line="240" w:lineRule="auto"/>
+              <w:jc w:val="center"/>
+            </w:pPr>
+            <w:r/>
+            <w:r>
+              <w:rPr>
+                <w:sz w:val="17"/>
+              </w:rPr>
+              <w:t>0,245</w:t>
+            </w:r>
+          </w:p>
+        </w:tc>
+        <w:tc>
+          <w:tcPr>
+            <w:tcW w:type="dxa" w:w="1134"/>
+          </w:tcPr>
+          <w:p>
+            <w:pPr>
+              <w:spacing w:after="20" w:line="240" w:lineRule="auto"/>
+              <w:jc w:val="center"/>
+            </w:pPr>
+            <w:r/>
+            <w:r>
+              <w:rPr>
+                <w:sz w:val="17"/>
+              </w:rPr>
+              <w:t>0,779</w:t>
             </w:r>
           </w:p>
         </w:tc>
@@ -16241,13 +16946,13 @@
         <w:rPr>
           <w:b/>
         </w:rPr>
-        <w:t>Regressão logística, KNN, MLP e Naive Bayes:</w:t>
+        <w:t>Regressão logística, SVM, KNN, K-Means, MLP e Naive Bayes:</w:t>
       </w:r>
       <w:r>
         <w:rPr>
           <w:b w:val="0"/>
         </w:rPr>
-        <w:t xml:space="preserve"> claramente inferiores. A regressão logística (0,806 na validação, 0,813 em CV) mal supera a baseline (79,5% na validação) e tem recall de apenas 0,159 (24 de 151 positivos identificados), pelo que a fronteira de decisão é fortemente não linear. O KNN (0,887) supera a baseline mas tem recall baixo (0,609); o MLP (0,789 na validação) fica abaixo da baseline na accuracy, apesar de recall de 0,748; o Naive Bayes (0,533) é pior do que classificar tudo como «sem desconto».</w:t>
+        <w:t xml:space="preserve"> claramente inferiores. O SVM com núcleo RBF (0,879 na validação, 0,866 em CV; precision 0,739 e recall 0,636) é, com o KNN, o melhor deste grupo, mas fica 7 a 8 pontos abaixo dos conjuntos de árvores; o K-Means (0,799) fica ao nível da baseline (79,5% na validação) com recall de 0,159. A regressão logística (0,806 na validação, 0,813 em CV) mal supera a baseline (79,5% na validação) e tem recall de apenas 0,159 (24 de 151 positivos identificados), pelo que a fronteira de decisão é fortemente não linear. O KNN (0,887) supera a baseline mas tem recall baixo (0,609); o MLP (0,789 na validação) fica abaixo da baseline na accuracy, apesar de recall de 0,748; o Naive Bayes (0,533) é pior do que classificar tudo como «sem desconto».</w:t>
       </w:r>
     </w:p>
     <w:p>
@@ -16273,7 +16978,7 @@
           <w:b w:val="0"/>
           <w:i w:val="0"/>
         </w:rPr>
-        <w:t xml:space="preserve"> O que é estatisticamente claro é a superioridade deste grupo sobre a regressão logística, o KNN, o MLP e o Naive Bayes.</w:t>
+        <w:t xml:space="preserve"> O que é estatisticamente claro é a superioridade deste grupo sobre a regressão logística, o SVM, o KNN, o K-Means, o MLP e o Naive Bayes.</w:t>
       </w:r>
     </w:p>
     <w:p>
@@ -16342,6 +17047,46 @@
           <w:i w:val="0"/>
         </w:rPr>
         <w:t>A melhor configuração usou C = 10 (regularização L2 fraca), sem reamostragem. Na validação obtém accuracy de 0,806, precision de 0,600, recall de 0,159, F-measure de 0,251 e AUC de 0,762: classifica corretamente 569 dos 585 negativos mas só 24 dos 151 positivos (127 falsos negativos). Como a accuracy é só 1,1 pontos percentuais superior à baseline de 79,5%, o modelo é, na prática, pouco melhor do que prever sempre «sem desconto». A regressão logística só capta efeitos lineares e aditivos nas variáveis padronizadas, ao passo que os modelos de árvores exploram interações e limiares; as correlações lineares fracas com y (secção 2.2.4) já antecipavam esta limitação. Mantém, em contrapartida, a vantagem de os coeficientes serem interpretáveis, e funciona como referência para quantificar o ganho dos modelos não lineares (cerca de 14 a 15 pontos percentuais de accuracy).</w:t>
+      </w:r>
+    </w:p>
+    <w:p>
+      <w:pPr>
+        <w:pStyle w:val="Heading3"/>
+      </w:pPr>
+      <w:r>
+        <w:t>SVM</w:t>
+      </w:r>
+    </w:p>
+    <w:p>
+      <w:pPr>
+        <w:jc w:val="both"/>
+      </w:pPr>
+      <w:r>
+        <w:rPr>
+          <w:b w:val="0"/>
+          <w:i w:val="0"/>
+        </w:rPr>
+        <w:t>A melhor configuração usou núcleo RBF com C = 100 e gamma = 0,1, sem reamostragem. Na validação obtém accuracy de 0,879, precision de 0,739, recall de 0,636, F-measure de 0,683 e AUC de 0,868 (calculada a partir da pontuação de decisão): identifica 96 dos 151 positivos com 34 falsos positivos. Fica ligeiramente abaixo do KNN e muito abaixo dos conjuntos de árvores; o desempenho, tal como no KNN, depende de uma noção de distância/kernel sobre 26 variáveis de natureza muito diferente (binárias e contínuas padronizadas), e o valor ótimo de C está no limite superior da grelha (100), pelo que uma grelha mais ampla poderia melhorar ligeiramente o resultado. Com os parâmetros por omissão (C = 1) a accuracy no mesmo conjunto de validação é de 0,813 e a F-measure de 0,296, ou seja, a afinação foi decisiva.</w:t>
+      </w:r>
+    </w:p>
+    <w:p>
+      <w:pPr>
+        <w:pStyle w:val="Heading3"/>
+      </w:pPr>
+      <w:r>
+        <w:t>K-Means (como classificador)</w:t>
+      </w:r>
+    </w:p>
+    <w:p>
+      <w:pPr>
+        <w:jc w:val="both"/>
+      </w:pPr>
+      <w:r>
+        <w:rPr>
+          <w:b w:val="0"/>
+          <w:i w:val="0"/>
+        </w:rPr>
+        <w:t>Com k = 2, como no notebook das aulas, os dois clusters têm como classe maioritária a classe 0, pelo que o modelo prevê sempre «sem desconto»: accuracy de 0,795 (igual à baseline) e recall nulo. Aumentar k até 64 prototypes melhora pouco (accuracy de 0,799 na validação e 0,807 em CV, recall de 0,159). Isto mostra que a estrutura de grupos presente nas variáveis, por distância euclidiana, quase não está alinhada com a existência de desconto, e que um método não supervisionado não é adequado a este problema sem usar a informação de y na construção dos grupos.</w:t>
       </w:r>
     </w:p>
     <w:p>
@@ -16423,6 +17168,865 @@
         </w:rPr>
         <w:t>O AdaBoost (300 estimadores, taxa de aprendizagem 1, árvores de profundidade 5, sem reamostragem) obteve a maior accuracy em CV (0,951 ± 0,008), mas na validação ficou em 0,946, com F-measure de 0,861. O Gradient Boosting (200 árvores de profundidade 7, taxa 0,1, subamostragem 0,8) obteve 0,949 em CV e 0,951 na validação, com a precision mais alta do grupo depois do Bagging (0,932). Nenhum dos dois beneficiou do SMOTE; uma possível explicação é que o boosting, ao dar peso crescente aos exemplos mal classificados, é menos sensível ao desequilíbrio, mas esta hipótese não foi testada.</w:t>
       </w:r>
+    </w:p>
+    <w:p>
+      <w:pPr>
+        <w:pStyle w:val="Heading3"/>
+      </w:pPr>
+      <w:r>
+        <w:t>Modelos base das aulas e efeito da afinação</w:t>
+      </w:r>
+    </w:p>
+    <w:p>
+      <w:pPr>
+        <w:jc w:val="both"/>
+      </w:pPr>
+      <w:r>
+        <w:rPr>
+          <w:b w:val="0"/>
+          <w:i w:val="0"/>
+        </w:rPr>
+        <w:t>A Tabela 13 compara os modelos dos notebooks das aulas, com os parâmetros usados nas aulas, e os mesmos algoritmos depois da afinação por validação cruzada, ambos medidos no conjunto de validação. A afinação traz ganhos em todos os modelos, muito grandes no KNN e no SVM, moderados no Naive Bayes e na árvore e quase nulos no K-Means, que com k = 2 coincide com a baseline.</w:t>
+      </w:r>
+    </w:p>
+    <w:p>
+      <w:pPr>
+        <w:keepNext/>
+        <w:spacing w:after="60"/>
+        <w:jc w:val="center"/>
+      </w:pPr>
+      <w:r>
+        <w:rPr>
+          <w:i/>
+          <w:sz w:val="19"/>
+        </w:rPr>
+        <w:t>Tabela 13 – Modelos com parâmetros das aulas vs. modelos afinados (conjunto de validação, classe 1).</w:t>
+      </w:r>
+    </w:p>
+    <w:tbl>
+      <w:tblPr>
+        <w:tblStyle w:val="TableGrid"/>
+        <w:tblW w:type="auto" w:w="0"/>
+        <w:jc w:val="center"/>
+        <w:tblLook w:firstColumn="1" w:firstRow="1" w:lastColumn="0" w:lastRow="0" w:noHBand="0" w:noVBand="1" w:val="04A0"/>
+      </w:tblPr>
+      <w:tblGrid>
+        <w:gridCol w:w="1296"/>
+        <w:gridCol w:w="1296"/>
+        <w:gridCol w:w="1296"/>
+        <w:gridCol w:w="1296"/>
+        <w:gridCol w:w="1296"/>
+        <w:gridCol w:w="1296"/>
+        <w:gridCol w:w="1296"/>
+      </w:tblGrid>
+      <w:tr>
+        <w:tc>
+          <w:tcPr>
+            <w:tcW w:type="dxa" w:w="1296"/>
+            <w:shd w:val="clear" w:color="auto" w:fill="9B1C2E"/>
+          </w:tcPr>
+          <w:p>
+            <w:pPr>
+              <w:spacing w:after="20" w:line="240" w:lineRule="auto"/>
+              <w:jc w:val="center"/>
+            </w:pPr>
+            <w:r/>
+            <w:r>
+              <w:rPr>
+                <w:b/>
+                <w:color w:val="FFFFFF"/>
+                <w:sz w:val="17"/>
+              </w:rPr>
+              <w:t>Modelo</w:t>
+            </w:r>
+          </w:p>
+        </w:tc>
+        <w:tc>
+          <w:tcPr>
+            <w:tcW w:type="dxa" w:w="1296"/>
+            <w:shd w:val="clear" w:color="auto" w:fill="9B1C2E"/>
+          </w:tcPr>
+          <w:p>
+            <w:pPr>
+              <w:spacing w:after="20" w:line="240" w:lineRule="auto"/>
+              <w:jc w:val="center"/>
+            </w:pPr>
+            <w:r/>
+            <w:r>
+              <w:rPr>
+                <w:b/>
+                <w:color w:val="FFFFFF"/>
+                <w:sz w:val="17"/>
+              </w:rPr>
+              <w:t>Accuracy (aulas)</w:t>
+            </w:r>
+          </w:p>
+        </w:tc>
+        <w:tc>
+          <w:tcPr>
+            <w:tcW w:type="dxa" w:w="1296"/>
+            <w:shd w:val="clear" w:color="auto" w:fill="9B1C2E"/>
+          </w:tcPr>
+          <w:p>
+            <w:pPr>
+              <w:spacing w:after="20" w:line="240" w:lineRule="auto"/>
+              <w:jc w:val="center"/>
+            </w:pPr>
+            <w:r/>
+            <w:r>
+              <w:rPr>
+                <w:b/>
+                <w:color w:val="FFFFFF"/>
+                <w:sz w:val="17"/>
+              </w:rPr>
+              <w:t>Recall (aulas)</w:t>
+            </w:r>
+          </w:p>
+        </w:tc>
+        <w:tc>
+          <w:tcPr>
+            <w:tcW w:type="dxa" w:w="1296"/>
+            <w:shd w:val="clear" w:color="auto" w:fill="9B1C2E"/>
+          </w:tcPr>
+          <w:p>
+            <w:pPr>
+              <w:spacing w:after="20" w:line="240" w:lineRule="auto"/>
+              <w:jc w:val="center"/>
+            </w:pPr>
+            <w:r/>
+            <w:r>
+              <w:rPr>
+                <w:b/>
+                <w:color w:val="FFFFFF"/>
+                <w:sz w:val="17"/>
+              </w:rPr>
+              <w:t>F-measure (aulas)</w:t>
+            </w:r>
+          </w:p>
+        </w:tc>
+        <w:tc>
+          <w:tcPr>
+            <w:tcW w:type="dxa" w:w="1296"/>
+            <w:shd w:val="clear" w:color="auto" w:fill="9B1C2E"/>
+          </w:tcPr>
+          <w:p>
+            <w:pPr>
+              <w:spacing w:after="20" w:line="240" w:lineRule="auto"/>
+              <w:jc w:val="center"/>
+            </w:pPr>
+            <w:r/>
+            <w:r>
+              <w:rPr>
+                <w:b/>
+                <w:color w:val="FFFFFF"/>
+                <w:sz w:val="17"/>
+              </w:rPr>
+              <w:t>Accuracy (afinado)</w:t>
+            </w:r>
+          </w:p>
+        </w:tc>
+        <w:tc>
+          <w:tcPr>
+            <w:tcW w:type="dxa" w:w="1296"/>
+            <w:shd w:val="clear" w:color="auto" w:fill="9B1C2E"/>
+          </w:tcPr>
+          <w:p>
+            <w:pPr>
+              <w:spacing w:after="20" w:line="240" w:lineRule="auto"/>
+              <w:jc w:val="center"/>
+            </w:pPr>
+            <w:r/>
+            <w:r>
+              <w:rPr>
+                <w:b/>
+                <w:color w:val="FFFFFF"/>
+                <w:sz w:val="17"/>
+              </w:rPr>
+              <w:t>Recall (afinado)</w:t>
+            </w:r>
+          </w:p>
+        </w:tc>
+        <w:tc>
+          <w:tcPr>
+            <w:tcW w:type="dxa" w:w="1296"/>
+            <w:shd w:val="clear" w:color="auto" w:fill="9B1C2E"/>
+          </w:tcPr>
+          <w:p>
+            <w:pPr>
+              <w:spacing w:after="20" w:line="240" w:lineRule="auto"/>
+              <w:jc w:val="center"/>
+            </w:pPr>
+            <w:r/>
+            <w:r>
+              <w:rPr>
+                <w:b/>
+                <w:color w:val="FFFFFF"/>
+                <w:sz w:val="17"/>
+              </w:rPr>
+              <w:t>F-measure (afinado)</w:t>
+            </w:r>
+          </w:p>
+        </w:tc>
+      </w:tr>
+      <w:tr>
+        <w:tc>
+          <w:tcPr>
+            <w:tcW w:type="dxa" w:w="1296"/>
+          </w:tcPr>
+          <w:p>
+            <w:pPr>
+              <w:spacing w:after="20" w:line="240" w:lineRule="auto"/>
+              <w:jc w:val="left"/>
+            </w:pPr>
+            <w:r/>
+            <w:r>
+              <w:rPr>
+                <w:sz w:val="17"/>
+              </w:rPr>
+              <w:t>Árvore de Decisão</w:t>
+            </w:r>
+          </w:p>
+        </w:tc>
+        <w:tc>
+          <w:tcPr>
+            <w:tcW w:type="dxa" w:w="1296"/>
+          </w:tcPr>
+          <w:p>
+            <w:pPr>
+              <w:spacing w:after="20" w:line="240" w:lineRule="auto"/>
+              <w:jc w:val="center"/>
+            </w:pPr>
+            <w:r/>
+            <w:r>
+              <w:rPr>
+                <w:sz w:val="17"/>
+              </w:rPr>
+              <w:t>0,936</w:t>
+            </w:r>
+          </w:p>
+        </w:tc>
+        <w:tc>
+          <w:tcPr>
+            <w:tcW w:type="dxa" w:w="1296"/>
+          </w:tcPr>
+          <w:p>
+            <w:pPr>
+              <w:spacing w:after="20" w:line="240" w:lineRule="auto"/>
+              <w:jc w:val="center"/>
+            </w:pPr>
+            <w:r/>
+            <w:r>
+              <w:rPr>
+                <w:sz w:val="17"/>
+              </w:rPr>
+              <w:t>0,808</w:t>
+            </w:r>
+          </w:p>
+        </w:tc>
+        <w:tc>
+          <w:tcPr>
+            <w:tcW w:type="dxa" w:w="1296"/>
+          </w:tcPr>
+          <w:p>
+            <w:pPr>
+              <w:spacing w:after="20" w:line="240" w:lineRule="auto"/>
+              <w:jc w:val="center"/>
+            </w:pPr>
+            <w:r/>
+            <w:r>
+              <w:rPr>
+                <w:sz w:val="17"/>
+              </w:rPr>
+              <w:t>0,838</w:t>
+            </w:r>
+          </w:p>
+        </w:tc>
+        <w:tc>
+          <w:tcPr>
+            <w:tcW w:type="dxa" w:w="1296"/>
+          </w:tcPr>
+          <w:p>
+            <w:pPr>
+              <w:spacing w:after="20" w:line="240" w:lineRule="auto"/>
+              <w:jc w:val="center"/>
+            </w:pPr>
+            <w:r/>
+            <w:r>
+              <w:rPr>
+                <w:sz w:val="17"/>
+              </w:rPr>
+              <w:t>0,942</w:t>
+            </w:r>
+          </w:p>
+        </w:tc>
+        <w:tc>
+          <w:tcPr>
+            <w:tcW w:type="dxa" w:w="1296"/>
+          </w:tcPr>
+          <w:p>
+            <w:pPr>
+              <w:spacing w:after="20" w:line="240" w:lineRule="auto"/>
+              <w:jc w:val="center"/>
+            </w:pPr>
+            <w:r/>
+            <w:r>
+              <w:rPr>
+                <w:sz w:val="17"/>
+              </w:rPr>
+              <w:t>0,861</w:t>
+            </w:r>
+          </w:p>
+        </w:tc>
+        <w:tc>
+          <w:tcPr>
+            <w:tcW w:type="dxa" w:w="1296"/>
+          </w:tcPr>
+          <w:p>
+            <w:pPr>
+              <w:spacing w:after="20" w:line="240" w:lineRule="auto"/>
+              <w:jc w:val="center"/>
+            </w:pPr>
+            <w:r/>
+            <w:r>
+              <w:rPr>
+                <w:sz w:val="17"/>
+              </w:rPr>
+              <w:t>0,858</w:t>
+            </w:r>
+          </w:p>
+        </w:tc>
+      </w:tr>
+      <w:tr>
+        <w:tc>
+          <w:tcPr>
+            <w:tcW w:type="dxa" w:w="1296"/>
+            <w:shd w:val="clear" w:color="auto" w:fill="F2F2F2"/>
+          </w:tcPr>
+          <w:p>
+            <w:pPr>
+              <w:spacing w:after="20" w:line="240" w:lineRule="auto"/>
+              <w:jc w:val="left"/>
+            </w:pPr>
+            <w:r/>
+            <w:r>
+              <w:rPr>
+                <w:sz w:val="17"/>
+              </w:rPr>
+              <w:t>KNN (k = 4)</w:t>
+            </w:r>
+          </w:p>
+        </w:tc>
+        <w:tc>
+          <w:tcPr>
+            <w:tcW w:type="dxa" w:w="1296"/>
+            <w:shd w:val="clear" w:color="auto" w:fill="F2F2F2"/>
+          </w:tcPr>
+          <w:p>
+            <w:pPr>
+              <w:spacing w:after="20" w:line="240" w:lineRule="auto"/>
+              <w:jc w:val="center"/>
+            </w:pPr>
+            <w:r/>
+            <w:r>
+              <w:rPr>
+                <w:sz w:val="17"/>
+              </w:rPr>
+              <w:t>0,833</w:t>
+            </w:r>
+          </w:p>
+        </w:tc>
+        <w:tc>
+          <w:tcPr>
+            <w:tcW w:type="dxa" w:w="1296"/>
+            <w:shd w:val="clear" w:color="auto" w:fill="F2F2F2"/>
+          </w:tcPr>
+          <w:p>
+            <w:pPr>
+              <w:spacing w:after="20" w:line="240" w:lineRule="auto"/>
+              <w:jc w:val="center"/>
+            </w:pPr>
+            <w:r/>
+            <w:r>
+              <w:rPr>
+                <w:sz w:val="17"/>
+              </w:rPr>
+              <w:t>0,325</w:t>
+            </w:r>
+          </w:p>
+        </w:tc>
+        <w:tc>
+          <w:tcPr>
+            <w:tcW w:type="dxa" w:w="1296"/>
+            <w:shd w:val="clear" w:color="auto" w:fill="F2F2F2"/>
+          </w:tcPr>
+          <w:p>
+            <w:pPr>
+              <w:spacing w:after="20" w:line="240" w:lineRule="auto"/>
+              <w:jc w:val="center"/>
+            </w:pPr>
+            <w:r/>
+            <w:r>
+              <w:rPr>
+                <w:sz w:val="17"/>
+              </w:rPr>
+              <w:t>0,443</w:t>
+            </w:r>
+          </w:p>
+        </w:tc>
+        <w:tc>
+          <w:tcPr>
+            <w:tcW w:type="dxa" w:w="1296"/>
+            <w:shd w:val="clear" w:color="auto" w:fill="F2F2F2"/>
+          </w:tcPr>
+          <w:p>
+            <w:pPr>
+              <w:spacing w:after="20" w:line="240" w:lineRule="auto"/>
+              <w:jc w:val="center"/>
+            </w:pPr>
+            <w:r/>
+            <w:r>
+              <w:rPr>
+                <w:sz w:val="17"/>
+              </w:rPr>
+              <w:t>0,887</w:t>
+            </w:r>
+          </w:p>
+        </w:tc>
+        <w:tc>
+          <w:tcPr>
+            <w:tcW w:type="dxa" w:w="1296"/>
+            <w:shd w:val="clear" w:color="auto" w:fill="F2F2F2"/>
+          </w:tcPr>
+          <w:p>
+            <w:pPr>
+              <w:spacing w:after="20" w:line="240" w:lineRule="auto"/>
+              <w:jc w:val="center"/>
+            </w:pPr>
+            <w:r/>
+            <w:r>
+              <w:rPr>
+                <w:sz w:val="17"/>
+              </w:rPr>
+              <w:t>0,609</w:t>
+            </w:r>
+          </w:p>
+        </w:tc>
+        <w:tc>
+          <w:tcPr>
+            <w:tcW w:type="dxa" w:w="1296"/>
+            <w:shd w:val="clear" w:color="auto" w:fill="F2F2F2"/>
+          </w:tcPr>
+          <w:p>
+            <w:pPr>
+              <w:spacing w:after="20" w:line="240" w:lineRule="auto"/>
+              <w:jc w:val="center"/>
+            </w:pPr>
+            <w:r/>
+            <w:r>
+              <w:rPr>
+                <w:sz w:val="17"/>
+              </w:rPr>
+              <w:t>0,689</w:t>
+            </w:r>
+          </w:p>
+        </w:tc>
+      </w:tr>
+      <w:tr>
+        <w:tc>
+          <w:tcPr>
+            <w:tcW w:type="dxa" w:w="1296"/>
+          </w:tcPr>
+          <w:p>
+            <w:pPr>
+              <w:spacing w:after="20" w:line="240" w:lineRule="auto"/>
+              <w:jc w:val="left"/>
+            </w:pPr>
+            <w:r/>
+            <w:r>
+              <w:rPr>
+                <w:sz w:val="17"/>
+              </w:rPr>
+              <w:t>Naive Bayes</w:t>
+            </w:r>
+          </w:p>
+        </w:tc>
+        <w:tc>
+          <w:tcPr>
+            <w:tcW w:type="dxa" w:w="1296"/>
+          </w:tcPr>
+          <w:p>
+            <w:pPr>
+              <w:spacing w:after="20" w:line="240" w:lineRule="auto"/>
+              <w:jc w:val="center"/>
+            </w:pPr>
+            <w:r/>
+            <w:r>
+              <w:rPr>
+                <w:sz w:val="17"/>
+              </w:rPr>
+              <w:t>0,372</w:t>
+            </w:r>
+          </w:p>
+        </w:tc>
+        <w:tc>
+          <w:tcPr>
+            <w:tcW w:type="dxa" w:w="1296"/>
+          </w:tcPr>
+          <w:p>
+            <w:pPr>
+              <w:spacing w:after="20" w:line="240" w:lineRule="auto"/>
+              <w:jc w:val="center"/>
+            </w:pPr>
+            <w:r/>
+            <w:r>
+              <w:rPr>
+                <w:sz w:val="17"/>
+              </w:rPr>
+              <w:t>0,940</w:t>
+            </w:r>
+          </w:p>
+        </w:tc>
+        <w:tc>
+          <w:tcPr>
+            <w:tcW w:type="dxa" w:w="1296"/>
+          </w:tcPr>
+          <w:p>
+            <w:pPr>
+              <w:spacing w:after="20" w:line="240" w:lineRule="auto"/>
+              <w:jc w:val="center"/>
+            </w:pPr>
+            <w:r/>
+            <w:r>
+              <w:rPr>
+                <w:sz w:val="17"/>
+              </w:rPr>
+              <w:t>0,381</w:t>
+            </w:r>
+          </w:p>
+        </w:tc>
+        <w:tc>
+          <w:tcPr>
+            <w:tcW w:type="dxa" w:w="1296"/>
+          </w:tcPr>
+          <w:p>
+            <w:pPr>
+              <w:spacing w:after="20" w:line="240" w:lineRule="auto"/>
+              <w:jc w:val="center"/>
+            </w:pPr>
+            <w:r/>
+            <w:r>
+              <w:rPr>
+                <w:sz w:val="17"/>
+              </w:rPr>
+              <w:t>0,533</w:t>
+            </w:r>
+          </w:p>
+        </w:tc>
+        <w:tc>
+          <w:tcPr>
+            <w:tcW w:type="dxa" w:w="1296"/>
+          </w:tcPr>
+          <w:p>
+            <w:pPr>
+              <w:spacing w:after="20" w:line="240" w:lineRule="auto"/>
+              <w:jc w:val="center"/>
+            </w:pPr>
+            <w:r/>
+            <w:r>
+              <w:rPr>
+                <w:sz w:val="17"/>
+              </w:rPr>
+              <w:t>0,801</w:t>
+            </w:r>
+          </w:p>
+        </w:tc>
+        <w:tc>
+          <w:tcPr>
+            <w:tcW w:type="dxa" w:w="1296"/>
+          </w:tcPr>
+          <w:p>
+            <w:pPr>
+              <w:spacing w:after="20" w:line="240" w:lineRule="auto"/>
+              <w:jc w:val="center"/>
+            </w:pPr>
+            <w:r/>
+            <w:r>
+              <w:rPr>
+                <w:sz w:val="17"/>
+              </w:rPr>
+              <w:t>0,413</w:t>
+            </w:r>
+          </w:p>
+        </w:tc>
+      </w:tr>
+      <w:tr>
+        <w:tc>
+          <w:tcPr>
+            <w:tcW w:type="dxa" w:w="1296"/>
+            <w:shd w:val="clear" w:color="auto" w:fill="F2F2F2"/>
+          </w:tcPr>
+          <w:p>
+            <w:pPr>
+              <w:spacing w:after="20" w:line="240" w:lineRule="auto"/>
+              <w:jc w:val="left"/>
+            </w:pPr>
+            <w:r/>
+            <w:r>
+              <w:rPr>
+                <w:sz w:val="17"/>
+              </w:rPr>
+              <w:t>SVM</w:t>
+            </w:r>
+          </w:p>
+        </w:tc>
+        <w:tc>
+          <w:tcPr>
+            <w:tcW w:type="dxa" w:w="1296"/>
+            <w:shd w:val="clear" w:color="auto" w:fill="F2F2F2"/>
+          </w:tcPr>
+          <w:p>
+            <w:pPr>
+              <w:spacing w:after="20" w:line="240" w:lineRule="auto"/>
+              <w:jc w:val="center"/>
+            </w:pPr>
+            <w:r/>
+            <w:r>
+              <w:rPr>
+                <w:sz w:val="17"/>
+              </w:rPr>
+              <w:t>0,812</w:t>
+            </w:r>
+          </w:p>
+        </w:tc>
+        <w:tc>
+          <w:tcPr>
+            <w:tcW w:type="dxa" w:w="1296"/>
+            <w:shd w:val="clear" w:color="auto" w:fill="F2F2F2"/>
+          </w:tcPr>
+          <w:p>
+            <w:pPr>
+              <w:spacing w:after="20" w:line="240" w:lineRule="auto"/>
+              <w:jc w:val="center"/>
+            </w:pPr>
+            <w:r/>
+            <w:r>
+              <w:rPr>
+                <w:sz w:val="17"/>
+              </w:rPr>
+              <w:t>0,192</w:t>
+            </w:r>
+          </w:p>
+        </w:tc>
+        <w:tc>
+          <w:tcPr>
+            <w:tcW w:type="dxa" w:w="1296"/>
+            <w:shd w:val="clear" w:color="auto" w:fill="F2F2F2"/>
+          </w:tcPr>
+          <w:p>
+            <w:pPr>
+              <w:spacing w:after="20" w:line="240" w:lineRule="auto"/>
+              <w:jc w:val="center"/>
+            </w:pPr>
+            <w:r/>
+            <w:r>
+              <w:rPr>
+                <w:sz w:val="17"/>
+              </w:rPr>
+              <w:t>0,296</w:t>
+            </w:r>
+          </w:p>
+        </w:tc>
+        <w:tc>
+          <w:tcPr>
+            <w:tcW w:type="dxa" w:w="1296"/>
+            <w:shd w:val="clear" w:color="auto" w:fill="F2F2F2"/>
+          </w:tcPr>
+          <w:p>
+            <w:pPr>
+              <w:spacing w:after="20" w:line="240" w:lineRule="auto"/>
+              <w:jc w:val="center"/>
+            </w:pPr>
+            <w:r/>
+            <w:r>
+              <w:rPr>
+                <w:sz w:val="17"/>
+              </w:rPr>
+              <w:t>0,879</w:t>
+            </w:r>
+          </w:p>
+        </w:tc>
+        <w:tc>
+          <w:tcPr>
+            <w:tcW w:type="dxa" w:w="1296"/>
+            <w:shd w:val="clear" w:color="auto" w:fill="F2F2F2"/>
+          </w:tcPr>
+          <w:p>
+            <w:pPr>
+              <w:spacing w:after="20" w:line="240" w:lineRule="auto"/>
+              <w:jc w:val="center"/>
+            </w:pPr>
+            <w:r/>
+            <w:r>
+              <w:rPr>
+                <w:sz w:val="17"/>
+              </w:rPr>
+              <w:t>0,636</w:t>
+            </w:r>
+          </w:p>
+        </w:tc>
+        <w:tc>
+          <w:tcPr>
+            <w:tcW w:type="dxa" w:w="1296"/>
+            <w:shd w:val="clear" w:color="auto" w:fill="F2F2F2"/>
+          </w:tcPr>
+          <w:p>
+            <w:pPr>
+              <w:spacing w:after="20" w:line="240" w:lineRule="auto"/>
+              <w:jc w:val="center"/>
+            </w:pPr>
+            <w:r/>
+            <w:r>
+              <w:rPr>
+                <w:sz w:val="17"/>
+              </w:rPr>
+              <w:t>0,683</w:t>
+            </w:r>
+          </w:p>
+        </w:tc>
+      </w:tr>
+      <w:tr>
+        <w:tc>
+          <w:tcPr>
+            <w:tcW w:type="dxa" w:w="1296"/>
+          </w:tcPr>
+          <w:p>
+            <w:pPr>
+              <w:spacing w:after="20" w:line="240" w:lineRule="auto"/>
+              <w:jc w:val="left"/>
+            </w:pPr>
+            <w:r/>
+            <w:r>
+              <w:rPr>
+                <w:sz w:val="17"/>
+              </w:rPr>
+              <w:t>K-Means (k = 2)</w:t>
+            </w:r>
+          </w:p>
+        </w:tc>
+        <w:tc>
+          <w:tcPr>
+            <w:tcW w:type="dxa" w:w="1296"/>
+          </w:tcPr>
+          <w:p>
+            <w:pPr>
+              <w:spacing w:after="20" w:line="240" w:lineRule="auto"/>
+              <w:jc w:val="center"/>
+            </w:pPr>
+            <w:r/>
+            <w:r>
+              <w:rPr>
+                <w:sz w:val="17"/>
+              </w:rPr>
+              <w:t>0,795</w:t>
+            </w:r>
+          </w:p>
+        </w:tc>
+        <w:tc>
+          <w:tcPr>
+            <w:tcW w:type="dxa" w:w="1296"/>
+          </w:tcPr>
+          <w:p>
+            <w:pPr>
+              <w:spacing w:after="20" w:line="240" w:lineRule="auto"/>
+              <w:jc w:val="center"/>
+            </w:pPr>
+            <w:r/>
+            <w:r>
+              <w:rPr>
+                <w:sz w:val="17"/>
+              </w:rPr>
+              <w:t>0,000</w:t>
+            </w:r>
+          </w:p>
+        </w:tc>
+        <w:tc>
+          <w:tcPr>
+            <w:tcW w:type="dxa" w:w="1296"/>
+          </w:tcPr>
+          <w:p>
+            <w:pPr>
+              <w:spacing w:after="20" w:line="240" w:lineRule="auto"/>
+              <w:jc w:val="center"/>
+            </w:pPr>
+            <w:r/>
+            <w:r>
+              <w:rPr>
+                <w:sz w:val="17"/>
+              </w:rPr>
+              <w:t>0,000</w:t>
+            </w:r>
+          </w:p>
+        </w:tc>
+        <w:tc>
+          <w:tcPr>
+            <w:tcW w:type="dxa" w:w="1296"/>
+          </w:tcPr>
+          <w:p>
+            <w:pPr>
+              <w:spacing w:after="20" w:line="240" w:lineRule="auto"/>
+              <w:jc w:val="center"/>
+            </w:pPr>
+            <w:r/>
+            <w:r>
+              <w:rPr>
+                <w:sz w:val="17"/>
+              </w:rPr>
+              <w:t>0,799</w:t>
+            </w:r>
+          </w:p>
+        </w:tc>
+        <w:tc>
+          <w:tcPr>
+            <w:tcW w:type="dxa" w:w="1296"/>
+          </w:tcPr>
+          <w:p>
+            <w:pPr>
+              <w:spacing w:after="20" w:line="240" w:lineRule="auto"/>
+              <w:jc w:val="center"/>
+            </w:pPr>
+            <w:r/>
+            <w:r>
+              <w:rPr>
+                <w:sz w:val="17"/>
+              </w:rPr>
+              <w:t>0,159</w:t>
+            </w:r>
+          </w:p>
+        </w:tc>
+        <w:tc>
+          <w:tcPr>
+            <w:tcW w:type="dxa" w:w="1296"/>
+          </w:tcPr>
+          <w:p>
+            <w:pPr>
+              <w:spacing w:after="20" w:line="240" w:lineRule="auto"/>
+              <w:jc w:val="center"/>
+            </w:pPr>
+            <w:r/>
+            <w:r>
+              <w:rPr>
+                <w:sz w:val="17"/>
+              </w:rPr>
+              <w:t>0,245</w:t>
+            </w:r>
+          </w:p>
+        </w:tc>
+      </w:tr>
+    </w:tbl>
+    <w:p>
+      <w:pPr>
+        <w:spacing w:after="80"/>
+      </w:pPr>
     </w:p>
     <w:p>
       <w:pPr>
@@ -16541,7 +18145,7 @@
           <w:i/>
           <w:sz w:val="19"/>
         </w:rPr>
-        <w:t>Tabela 13 – Contagens das matrizes de confusão no conjunto de validação (VN = verdadeiros negativos, FP = falsos positivos, FN = falsos negativos, VP = verdadeiros positivos).</w:t>
+        <w:t>Tabela 14 – Contagens das matrizes de confusão no conjunto de validação (VN = verdadeiros negativos, FP = falsos positivos, FN = falsos negativos, VP = verdadeiros positivos).</w:t>
       </w:r>
     </w:p>
     <w:tbl>
@@ -16869,7 +18473,7 @@
               <w:rPr>
                 <w:sz w:val="18"/>
               </w:rPr>
-              <w:t>Regressão Logística</w:t>
+              <w:t>K-Means (classificador)</w:t>
             </w:r>
           </w:p>
         </w:tc>
@@ -16887,7 +18491,7 @@
               <w:rPr>
                 <w:sz w:val="18"/>
               </w:rPr>
-              <w:t>569</w:t>
+              <w:t>564</w:t>
             </w:r>
           </w:p>
         </w:tc>
@@ -16905,7 +18509,7 @@
               <w:rPr>
                 <w:sz w:val="18"/>
               </w:rPr>
-              <w:t>16</w:t>
+              <w:t>21</w:t>
             </w:r>
           </w:p>
         </w:tc>
@@ -16962,7 +18566,7 @@
               <w:rPr>
                 <w:sz w:val="18"/>
               </w:rPr>
-              <w:t>Naive Bayes</w:t>
+              <w:t>Regressão Logística</w:t>
             </w:r>
           </w:p>
         </w:tc>
@@ -16981,7 +18585,7 @@
               <w:rPr>
                 <w:sz w:val="18"/>
               </w:rPr>
-              <w:t>271</w:t>
+              <w:t>569</w:t>
             </w:r>
           </w:p>
         </w:tc>
@@ -17000,7 +18604,7 @@
               <w:rPr>
                 <w:sz w:val="18"/>
               </w:rPr>
-              <w:t>314</w:t>
+              <w:t>16</w:t>
             </w:r>
           </w:p>
         </w:tc>
@@ -17019,7 +18623,7 @@
               <w:rPr>
                 <w:sz w:val="18"/>
               </w:rPr>
-              <w:t>30</w:t>
+              <w:t>127</w:t>
             </w:r>
           </w:p>
         </w:tc>
@@ -17038,7 +18642,7 @@
               <w:rPr>
                 <w:sz w:val="18"/>
               </w:rPr>
-              <w:t>121</w:t>
+              <w:t>24</w:t>
             </w:r>
           </w:p>
         </w:tc>
@@ -17058,6 +18662,99 @@
               <w:rPr>
                 <w:sz w:val="18"/>
               </w:rPr>
+              <w:t>Naive Bayes</w:t>
+            </w:r>
+          </w:p>
+        </w:tc>
+        <w:tc>
+          <w:tcPr>
+            <w:tcW w:type="dxa" w:w="1134"/>
+          </w:tcPr>
+          <w:p>
+            <w:pPr>
+              <w:spacing w:after="20" w:line="240" w:lineRule="auto"/>
+              <w:jc w:val="center"/>
+            </w:pPr>
+            <w:r/>
+            <w:r>
+              <w:rPr>
+                <w:sz w:val="18"/>
+              </w:rPr>
+              <w:t>271</w:t>
+            </w:r>
+          </w:p>
+        </w:tc>
+        <w:tc>
+          <w:tcPr>
+            <w:tcW w:type="dxa" w:w="1134"/>
+          </w:tcPr>
+          <w:p>
+            <w:pPr>
+              <w:spacing w:after="20" w:line="240" w:lineRule="auto"/>
+              <w:jc w:val="center"/>
+            </w:pPr>
+            <w:r/>
+            <w:r>
+              <w:rPr>
+                <w:sz w:val="18"/>
+              </w:rPr>
+              <w:t>314</w:t>
+            </w:r>
+          </w:p>
+        </w:tc>
+        <w:tc>
+          <w:tcPr>
+            <w:tcW w:type="dxa" w:w="1134"/>
+          </w:tcPr>
+          <w:p>
+            <w:pPr>
+              <w:spacing w:after="20" w:line="240" w:lineRule="auto"/>
+              <w:jc w:val="center"/>
+            </w:pPr>
+            <w:r/>
+            <w:r>
+              <w:rPr>
+                <w:sz w:val="18"/>
+              </w:rPr>
+              <w:t>30</w:t>
+            </w:r>
+          </w:p>
+        </w:tc>
+        <w:tc>
+          <w:tcPr>
+            <w:tcW w:type="dxa" w:w="1134"/>
+          </w:tcPr>
+          <w:p>
+            <w:pPr>
+              <w:spacing w:after="20" w:line="240" w:lineRule="auto"/>
+              <w:jc w:val="center"/>
+            </w:pPr>
+            <w:r/>
+            <w:r>
+              <w:rPr>
+                <w:sz w:val="18"/>
+              </w:rPr>
+              <w:t>121</w:t>
+            </w:r>
+          </w:p>
+        </w:tc>
+      </w:tr>
+      <w:tr>
+        <w:tc>
+          <w:tcPr>
+            <w:tcW w:type="dxa" w:w="2551"/>
+            <w:shd w:val="clear" w:color="auto" w:fill="F2F2F2"/>
+          </w:tcPr>
+          <w:p>
+            <w:pPr>
+              <w:spacing w:after="20" w:line="240" w:lineRule="auto"/>
+              <w:jc w:val="left"/>
+            </w:pPr>
+            <w:r/>
+            <w:r>
+              <w:rPr>
+                <w:sz w:val="18"/>
+              </w:rPr>
               <w:t>MLP</w:t>
             </w:r>
           </w:p>
@@ -17065,6 +18762,7 @@
         <w:tc>
           <w:tcPr>
             <w:tcW w:type="dxa" w:w="1134"/>
+            <w:shd w:val="clear" w:color="auto" w:fill="F2F2F2"/>
           </w:tcPr>
           <w:p>
             <w:pPr>
@@ -17083,6 +18781,7 @@
         <w:tc>
           <w:tcPr>
             <w:tcW w:type="dxa" w:w="1134"/>
+            <w:shd w:val="clear" w:color="auto" w:fill="F2F2F2"/>
           </w:tcPr>
           <w:p>
             <w:pPr>
@@ -17101,6 +18800,7 @@
         <w:tc>
           <w:tcPr>
             <w:tcW w:type="dxa" w:w="1134"/>
+            <w:shd w:val="clear" w:color="auto" w:fill="F2F2F2"/>
           </w:tcPr>
           <w:p>
             <w:pPr>
@@ -17119,6 +18819,7 @@
         <w:tc>
           <w:tcPr>
             <w:tcW w:type="dxa" w:w="1134"/>
+            <w:shd w:val="clear" w:color="auto" w:fill="F2F2F2"/>
           </w:tcPr>
           <w:p>
             <w:pPr>
@@ -17131,6 +18832,98 @@
                 <w:sz w:val="18"/>
               </w:rPr>
               <w:t>113</w:t>
+            </w:r>
+          </w:p>
+        </w:tc>
+      </w:tr>
+      <w:tr>
+        <w:tc>
+          <w:tcPr>
+            <w:tcW w:type="dxa" w:w="2551"/>
+          </w:tcPr>
+          <w:p>
+            <w:pPr>
+              <w:spacing w:after="20" w:line="240" w:lineRule="auto"/>
+              <w:jc w:val="left"/>
+            </w:pPr>
+            <w:r/>
+            <w:r>
+              <w:rPr>
+                <w:sz w:val="18"/>
+              </w:rPr>
+              <w:t>SVM</w:t>
+            </w:r>
+          </w:p>
+        </w:tc>
+        <w:tc>
+          <w:tcPr>
+            <w:tcW w:type="dxa" w:w="1134"/>
+          </w:tcPr>
+          <w:p>
+            <w:pPr>
+              <w:spacing w:after="20" w:line="240" w:lineRule="auto"/>
+              <w:jc w:val="center"/>
+            </w:pPr>
+            <w:r/>
+            <w:r>
+              <w:rPr>
+                <w:sz w:val="18"/>
+              </w:rPr>
+              <w:t>551</w:t>
+            </w:r>
+          </w:p>
+        </w:tc>
+        <w:tc>
+          <w:tcPr>
+            <w:tcW w:type="dxa" w:w="1134"/>
+          </w:tcPr>
+          <w:p>
+            <w:pPr>
+              <w:spacing w:after="20" w:line="240" w:lineRule="auto"/>
+              <w:jc w:val="center"/>
+            </w:pPr>
+            <w:r/>
+            <w:r>
+              <w:rPr>
+                <w:sz w:val="18"/>
+              </w:rPr>
+              <w:t>34</w:t>
+            </w:r>
+          </w:p>
+        </w:tc>
+        <w:tc>
+          <w:tcPr>
+            <w:tcW w:type="dxa" w:w="1134"/>
+          </w:tcPr>
+          <w:p>
+            <w:pPr>
+              <w:spacing w:after="20" w:line="240" w:lineRule="auto"/>
+              <w:jc w:val="center"/>
+            </w:pPr>
+            <w:r/>
+            <w:r>
+              <w:rPr>
+                <w:sz w:val="18"/>
+              </w:rPr>
+              <w:t>55</w:t>
+            </w:r>
+          </w:p>
+        </w:tc>
+        <w:tc>
+          <w:tcPr>
+            <w:tcW w:type="dxa" w:w="1134"/>
+          </w:tcPr>
+          <w:p>
+            <w:pPr>
+              <w:spacing w:after="20" w:line="240" w:lineRule="auto"/>
+              <w:jc w:val="center"/>
+            </w:pPr>
+            <w:r/>
+            <w:r>
+              <w:rPr>
+                <w:sz w:val="18"/>
+              </w:rPr>
+              <w:t>96</w:t>
             </w:r>
           </w:p>
         </w:tc>
@@ -17786,7 +19579,7 @@
           <w:b w:val="0"/>
           <w:i w:val="0"/>
         </w:rPr>
-        <w:t>, que mantém todos os registos idênticos no mesmo fold. Os resultados (Tabela 14) são semelhantes aos da CV simples (diferenças entre −0,5 e +0,4 pontos): Extra Trees 0,950, Random Forest 0,944, Gradient Boosting 0,944 e KNN 0,873 (CV simples: 0,946, 0,943, 0,949 e 0,870). Não há, portanto, sinais de que os duplicados inflacionem a accuracy estimada. A existência de 382 registos de task.csv (10,4%) com gémeo no treino é uma característica do problema e não um erro: nesses casos os modelos de árvores tendem a reproduzir a etiqueta conhecida, o que beneficia a accuracy na competição.</w:t>
+        <w:t>, que mantém todos os registos idênticos no mesmo fold. Os resultados (Tabela 15) são semelhantes aos da CV simples (diferenças entre −0,5 e +0,4 pontos): Extra Trees 0,950, Random Forest 0,944, Gradient Boosting 0,944 e KNN 0,873 (CV simples: 0,946, 0,943, 0,949 e 0,870). Não há, portanto, sinais de que os duplicados inflacionem a accuracy estimada. A existência de 382 registos de task.csv (10,4%) com gémeo no treino é uma característica do problema e não um erro: nesses casos os modelos de árvores tendem a reproduzir a etiqueta conhecida, o que beneficia a accuracy na competição.</w:t>
       </w:r>
     </w:p>
     <w:p>
@@ -17800,7 +19593,7 @@
           <w:i/>
           <w:sz w:val="19"/>
         </w:rPr>
-        <w:t>Tabela 14 – Accuracy em CV simples e em CV agrupada por registos idênticos.</w:t>
+        <w:t>Tabela 15 – Accuracy em CV simples e em CV agrupada por registos idênticos.</w:t>
       </w:r>
     </w:p>
     <w:tbl>
@@ -18235,6 +20028,401 @@
           <w:b w:val="0"/>
           <w:i w:val="0"/>
         </w:rPr>
+        <w:t>À semelhança do passo «Predict New Example» dos notebooks das aulas, a Tabela 16 mostra as previsões do modelo final para os primeiros produtos de task.csv.</w:t>
+      </w:r>
+    </w:p>
+    <w:p>
+      <w:pPr>
+        <w:keepNext/>
+        <w:spacing w:after="60"/>
+        <w:jc w:val="center"/>
+      </w:pPr>
+      <w:r>
+        <w:rPr>
+          <w:i/>
+          <w:sz w:val="19"/>
+        </w:rPr>
+        <w:t>Tabela 16 – Previsões do modelo final para os cinco primeiros registos de task.csv (1 = com desconto).</w:t>
+      </w:r>
+    </w:p>
+    <w:tbl>
+      <w:tblPr>
+        <w:tblStyle w:val="TableGrid"/>
+        <w:tblW w:type="auto" w:w="0"/>
+        <w:jc w:val="center"/>
+        <w:tblLook w:firstColumn="1" w:firstRow="1" w:lastColumn="0" w:lastRow="0" w:noHBand="0" w:noVBand="1" w:val="04A0"/>
+      </w:tblPr>
+      <w:tblGrid>
+        <w:gridCol w:w="3024"/>
+        <w:gridCol w:w="3024"/>
+        <w:gridCol w:w="3024"/>
+      </w:tblGrid>
+      <w:tr>
+        <w:tc>
+          <w:tcPr>
+            <w:tcW w:type="dxa" w:w="3024"/>
+            <w:shd w:val="clear" w:color="auto" w:fill="9B1C2E"/>
+          </w:tcPr>
+          <w:p>
+            <w:pPr>
+              <w:spacing w:after="20" w:line="240" w:lineRule="auto"/>
+              <w:jc w:val="center"/>
+            </w:pPr>
+            <w:r/>
+            <w:r>
+              <w:rPr>
+                <w:b/>
+                <w:color w:val="FFFFFF"/>
+                <w:sz w:val="18"/>
+              </w:rPr>
+              <w:t>i</w:t>
+            </w:r>
+          </w:p>
+        </w:tc>
+        <w:tc>
+          <w:tcPr>
+            <w:tcW w:type="dxa" w:w="3024"/>
+            <w:shd w:val="clear" w:color="auto" w:fill="9B1C2E"/>
+          </w:tcPr>
+          <w:p>
+            <w:pPr>
+              <w:spacing w:after="20" w:line="240" w:lineRule="auto"/>
+              <w:jc w:val="center"/>
+            </w:pPr>
+            <w:r/>
+            <w:r>
+              <w:rPr>
+                <w:b/>
+                <w:color w:val="FFFFFF"/>
+                <w:sz w:val="18"/>
+              </w:rPr>
+              <w:t>previsão (y)</w:t>
+            </w:r>
+          </w:p>
+        </w:tc>
+        <w:tc>
+          <w:tcPr>
+            <w:tcW w:type="dxa" w:w="3024"/>
+            <w:shd w:val="clear" w:color="auto" w:fill="9B1C2E"/>
+          </w:tcPr>
+          <w:p>
+            <w:pPr>
+              <w:spacing w:after="20" w:line="240" w:lineRule="auto"/>
+              <w:jc w:val="center"/>
+            </w:pPr>
+            <w:r/>
+            <w:r>
+              <w:rPr>
+                <w:b/>
+                <w:color w:val="FFFFFF"/>
+                <w:sz w:val="18"/>
+              </w:rPr>
+              <w:t>P(y=1)</w:t>
+            </w:r>
+          </w:p>
+        </w:tc>
+      </w:tr>
+      <w:tr>
+        <w:tc>
+          <w:tcPr>
+            <w:tcW w:type="dxa" w:w="3024"/>
+          </w:tcPr>
+          <w:p>
+            <w:pPr>
+              <w:spacing w:after="20" w:line="240" w:lineRule="auto"/>
+              <w:jc w:val="left"/>
+            </w:pPr>
+            <w:r/>
+            <w:r>
+              <w:rPr>
+                <w:sz w:val="18"/>
+              </w:rPr>
+              <w:t>1</w:t>
+            </w:r>
+          </w:p>
+        </w:tc>
+        <w:tc>
+          <w:tcPr>
+            <w:tcW w:type="dxa" w:w="3024"/>
+          </w:tcPr>
+          <w:p>
+            <w:pPr>
+              <w:spacing w:after="20" w:line="240" w:lineRule="auto"/>
+              <w:jc w:val="center"/>
+            </w:pPr>
+            <w:r/>
+            <w:r>
+              <w:rPr>
+                <w:sz w:val="18"/>
+              </w:rPr>
+              <w:t>0</w:t>
+            </w:r>
+          </w:p>
+        </w:tc>
+        <w:tc>
+          <w:tcPr>
+            <w:tcW w:type="dxa" w:w="3024"/>
+          </w:tcPr>
+          <w:p>
+            <w:pPr>
+              <w:spacing w:after="20" w:line="240" w:lineRule="auto"/>
+              <w:jc w:val="center"/>
+            </w:pPr>
+            <w:r/>
+            <w:r>
+              <w:rPr>
+                <w:sz w:val="18"/>
+              </w:rPr>
+              <w:t>0.434</w:t>
+            </w:r>
+          </w:p>
+        </w:tc>
+      </w:tr>
+      <w:tr>
+        <w:tc>
+          <w:tcPr>
+            <w:tcW w:type="dxa" w:w="3024"/>
+            <w:shd w:val="clear" w:color="auto" w:fill="F2F2F2"/>
+          </w:tcPr>
+          <w:p>
+            <w:pPr>
+              <w:spacing w:after="20" w:line="240" w:lineRule="auto"/>
+              <w:jc w:val="left"/>
+            </w:pPr>
+            <w:r/>
+            <w:r>
+              <w:rPr>
+                <w:sz w:val="18"/>
+              </w:rPr>
+              <w:t>6</w:t>
+            </w:r>
+          </w:p>
+        </w:tc>
+        <w:tc>
+          <w:tcPr>
+            <w:tcW w:type="dxa" w:w="3024"/>
+            <w:shd w:val="clear" w:color="auto" w:fill="F2F2F2"/>
+          </w:tcPr>
+          <w:p>
+            <w:pPr>
+              <w:spacing w:after="20" w:line="240" w:lineRule="auto"/>
+              <w:jc w:val="center"/>
+            </w:pPr>
+            <w:r/>
+            <w:r>
+              <w:rPr>
+                <w:sz w:val="18"/>
+              </w:rPr>
+              <w:t>1</w:t>
+            </w:r>
+          </w:p>
+        </w:tc>
+        <w:tc>
+          <w:tcPr>
+            <w:tcW w:type="dxa" w:w="3024"/>
+            <w:shd w:val="clear" w:color="auto" w:fill="F2F2F2"/>
+          </w:tcPr>
+          <w:p>
+            <w:pPr>
+              <w:spacing w:after="20" w:line="240" w:lineRule="auto"/>
+              <w:jc w:val="center"/>
+            </w:pPr>
+            <w:r/>
+            <w:r>
+              <w:rPr>
+                <w:sz w:val="18"/>
+              </w:rPr>
+              <w:t>0.554</w:t>
+            </w:r>
+          </w:p>
+        </w:tc>
+      </w:tr>
+      <w:tr>
+        <w:tc>
+          <w:tcPr>
+            <w:tcW w:type="dxa" w:w="3024"/>
+          </w:tcPr>
+          <w:p>
+            <w:pPr>
+              <w:spacing w:after="20" w:line="240" w:lineRule="auto"/>
+              <w:jc w:val="left"/>
+            </w:pPr>
+            <w:r/>
+            <w:r>
+              <w:rPr>
+                <w:sz w:val="18"/>
+              </w:rPr>
+              <w:t>9</w:t>
+            </w:r>
+          </w:p>
+        </w:tc>
+        <w:tc>
+          <w:tcPr>
+            <w:tcW w:type="dxa" w:w="3024"/>
+          </w:tcPr>
+          <w:p>
+            <w:pPr>
+              <w:spacing w:after="20" w:line="240" w:lineRule="auto"/>
+              <w:jc w:val="center"/>
+            </w:pPr>
+            <w:r/>
+            <w:r>
+              <w:rPr>
+                <w:sz w:val="18"/>
+              </w:rPr>
+              <w:t>0</w:t>
+            </w:r>
+          </w:p>
+        </w:tc>
+        <w:tc>
+          <w:tcPr>
+            <w:tcW w:type="dxa" w:w="3024"/>
+          </w:tcPr>
+          <w:p>
+            <w:pPr>
+              <w:spacing w:after="20" w:line="240" w:lineRule="auto"/>
+              <w:jc w:val="center"/>
+            </w:pPr>
+            <w:r/>
+            <w:r>
+              <w:rPr>
+                <w:sz w:val="18"/>
+              </w:rPr>
+              <w:t>0.381</w:t>
+            </w:r>
+          </w:p>
+        </w:tc>
+      </w:tr>
+      <w:tr>
+        <w:tc>
+          <w:tcPr>
+            <w:tcW w:type="dxa" w:w="3024"/>
+            <w:shd w:val="clear" w:color="auto" w:fill="F2F2F2"/>
+          </w:tcPr>
+          <w:p>
+            <w:pPr>
+              <w:spacing w:after="20" w:line="240" w:lineRule="auto"/>
+              <w:jc w:val="left"/>
+            </w:pPr>
+            <w:r/>
+            <w:r>
+              <w:rPr>
+                <w:sz w:val="18"/>
+              </w:rPr>
+              <w:t>10</w:t>
+            </w:r>
+          </w:p>
+        </w:tc>
+        <w:tc>
+          <w:tcPr>
+            <w:tcW w:type="dxa" w:w="3024"/>
+            <w:shd w:val="clear" w:color="auto" w:fill="F2F2F2"/>
+          </w:tcPr>
+          <w:p>
+            <w:pPr>
+              <w:spacing w:after="20" w:line="240" w:lineRule="auto"/>
+              <w:jc w:val="center"/>
+            </w:pPr>
+            <w:r/>
+            <w:r>
+              <w:rPr>
+                <w:sz w:val="18"/>
+              </w:rPr>
+              <w:t>0</w:t>
+            </w:r>
+          </w:p>
+        </w:tc>
+        <w:tc>
+          <w:tcPr>
+            <w:tcW w:type="dxa" w:w="3024"/>
+            <w:shd w:val="clear" w:color="auto" w:fill="F2F2F2"/>
+          </w:tcPr>
+          <w:p>
+            <w:pPr>
+              <w:spacing w:after="20" w:line="240" w:lineRule="auto"/>
+              <w:jc w:val="center"/>
+            </w:pPr>
+            <w:r/>
+            <w:r>
+              <w:rPr>
+                <w:sz w:val="18"/>
+              </w:rPr>
+              <w:t>0.304</w:t>
+            </w:r>
+          </w:p>
+        </w:tc>
+      </w:tr>
+      <w:tr>
+        <w:tc>
+          <w:tcPr>
+            <w:tcW w:type="dxa" w:w="3024"/>
+          </w:tcPr>
+          <w:p>
+            <w:pPr>
+              <w:spacing w:after="20" w:line="240" w:lineRule="auto"/>
+              <w:jc w:val="left"/>
+            </w:pPr>
+            <w:r/>
+            <w:r>
+              <w:rPr>
+                <w:sz w:val="18"/>
+              </w:rPr>
+              <w:t>11</w:t>
+            </w:r>
+          </w:p>
+        </w:tc>
+        <w:tc>
+          <w:tcPr>
+            <w:tcW w:type="dxa" w:w="3024"/>
+          </w:tcPr>
+          <w:p>
+            <w:pPr>
+              <w:spacing w:after="20" w:line="240" w:lineRule="auto"/>
+              <w:jc w:val="center"/>
+            </w:pPr>
+            <w:r/>
+            <w:r>
+              <w:rPr>
+                <w:sz w:val="18"/>
+              </w:rPr>
+              <w:t>0</w:t>
+            </w:r>
+          </w:p>
+        </w:tc>
+        <w:tc>
+          <w:tcPr>
+            <w:tcW w:type="dxa" w:w="3024"/>
+          </w:tcPr>
+          <w:p>
+            <w:pPr>
+              <w:spacing w:after="20" w:line="240" w:lineRule="auto"/>
+              <w:jc w:val="center"/>
+            </w:pPr>
+            <w:r/>
+            <w:r>
+              <w:rPr>
+                <w:sz w:val="18"/>
+              </w:rPr>
+              <w:t>0.474</w:t>
+            </w:r>
+          </w:p>
+        </w:tc>
+      </w:tr>
+    </w:tbl>
+    <w:p>
+      <w:pPr>
+        <w:spacing w:after="80"/>
+      </w:pPr>
+    </w:p>
+    <w:p>
+      <w:pPr>
+        <w:jc w:val="both"/>
+      </w:pPr>
+      <w:r>
+        <w:rPr>
+          <w:b w:val="0"/>
+          <w:i w:val="0"/>
+        </w:rPr>
         <w:t>Como task.csv não contém o alvo, a accuracy real da submissão é desconhecida; a melhor estimativa é a obtida em validação cruzada e na validação hold-out, isto é, cerca de 0,95 (intervalo plausível de ±0,01–0,02). Dado que os cinco melhores modelos são estatisticamente indistinguíveis, o resultado final na competição poderia ter sido ligeiramente diferente com qualquer um deles.</w:t>
       </w:r>
     </w:p>
@@ -18272,7 +20460,7 @@
           <w:b w:val="0"/>
           <w:i w:val="0"/>
         </w:rPr>
-        <w:t>Dos dez algoritmos comparados, os conjuntos de árvores (Bagging, Extra Trees, Gradient Boosting, Random Forest e AdaBoost) alcançaram accuracy entre 94,6% e 95,9% na validação, F-measure entre 0,86 e 0,90 e AUC entre 0,96 e 0,98, bastante acima da baseline de 79,4%, da regressão logística (80,6%), do KNN (88,7%), do MLP (78,9%) e do Naive Bayes (53,3%). A superioridade das árvores é coerente com a natureza dos dados: muitas variáveis binárias, variáveis de baixa cardinalidade, assimetrias e interações. Os cinco melhores modelos são, no entanto, estatisticamente indistinguíveis; o AdaBoost foi escolhido por apresentar a maior accuracy em validação cruzada.</w:t>
+        <w:t>Dos doze algoritmos comparados, os conjuntos de árvores (Bagging, Extra Trees, Gradient Boosting, Random Forest e AdaBoost) alcançaram accuracy entre 94,6% e 95,9% na validação, F-measure entre 0,86 e 0,90 e AUC entre 0,96 e 0,98, bastante acima da baseline de 79,4%, do SVM (87,9%), do KNN (88,7%), da regressão logística (80,6%), do K-Means (79,9%), do MLP (78,9%) e do Naive Bayes (53,3%). A superioridade das árvores é coerente com a natureza dos dados: muitas variáveis binárias, variáveis de baixa cardinalidade, assimetrias e interações. Os cinco melhores modelos são, no entanto, estatisticamente indistinguíveis; o AdaBoost foi escolhido por apresentar a maior accuracy em validação cruzada.</w:t>
       </w:r>
     </w:p>
     <w:p>
@@ -18454,6 +20642,15 @@
         <w:ind w:left="454" w:hanging="454"/>
       </w:pPr>
       <w:r>
+        <w:t>Cortes, C., &amp; Vapnik, V. (1995). Support-vector networks. Machine Learning, 20(3), 273–297.</w:t>
+      </w:r>
+    </w:p>
+    <w:p>
+      <w:pPr>
+        <w:spacing w:after="60"/>
+        <w:ind w:left="454" w:hanging="454"/>
+      </w:pPr>
+      <w:r>
         <w:t>Cover, T., &amp; Hart, P. (1967). Nearest neighbor pattern classification. IEEE Transactions on Information Theory, 13(1), 21–27.</w:t>
       </w:r>
     </w:p>
@@ -18508,6 +20705,15 @@
         <w:ind w:left="454" w:hanging="454"/>
       </w:pPr>
       <w:r>
+        <w:t>MacQueen, J. (1967). Some methods for classification and analysis of multivariate observations. Proceedings of the 5th Berkeley Symposium on Mathematical Statistics and Probability, 1, 281–297.</w:t>
+      </w:r>
+    </w:p>
+    <w:p>
+      <w:pPr>
+        <w:spacing w:after="60"/>
+        <w:ind w:left="454" w:hanging="454"/>
+      </w:pPr>
+      <w:r>
         <w:t>Pedregosa, F., et al. (2011). Scikit-learn: Machine learning in Python. Journal of Machine Learning Research, 12, 2825–2830.</w:t>
       </w:r>
     </w:p>
@@ -18544,7 +20750,7 @@
           <w:i/>
           <w:sz w:val="19"/>
         </w:rPr>
-        <w:t>Tabela 15 – Grelhas de pesquisa (5 folds por combinação; critério: accuracy).</w:t>
+        <w:t>Tabela 17 – Grelhas de pesquisa (5 folds por combinação; critério: accuracy).</w:t>
       </w:r>
     </w:p>
     <w:tbl>
@@ -18791,6 +20997,121 @@
                 <w:sz w:val="16"/>
               </w:rPr>
               <w:t>10</w:t>
+            </w:r>
+          </w:p>
+        </w:tc>
+      </w:tr>
+      <w:tr>
+        <w:tc>
+          <w:tcPr>
+            <w:tcW w:type="dxa" w:w="1701"/>
+            <w:shd w:val="clear" w:color="auto" w:fill="F2F2F2"/>
+          </w:tcPr>
+          <w:p>
+            <w:pPr>
+              <w:spacing w:after="20" w:line="240" w:lineRule="auto"/>
+              <w:jc w:val="left"/>
+            </w:pPr>
+            <w:r/>
+            <w:r>
+              <w:rPr>
+                <w:sz w:val="16"/>
+              </w:rPr>
+              <w:t>K-Means (classificador)</w:t>
+            </w:r>
+          </w:p>
+        </w:tc>
+        <w:tc>
+          <w:tcPr>
+            <w:tcW w:type="dxa" w:w="6236"/>
+            <w:shd w:val="clear" w:color="auto" w:fill="F2F2F2"/>
+          </w:tcPr>
+          <w:p>
+            <w:pPr>
+              <w:spacing w:after="20" w:line="240" w:lineRule="auto"/>
+              <w:jc w:val="center"/>
+            </w:pPr>
+            <w:r/>
+            <w:r>
+              <w:rPr>
+                <w:sz w:val="16"/>
+              </w:rPr>
+              <w:t>n_clusters ∈ {2,3,4,8,16,32,64}; reamostragem</w:t>
+            </w:r>
+          </w:p>
+        </w:tc>
+        <w:tc>
+          <w:tcPr>
+            <w:tcW w:type="dxa" w:w="1134"/>
+            <w:shd w:val="clear" w:color="auto" w:fill="F2F2F2"/>
+          </w:tcPr>
+          <w:p>
+            <w:pPr>
+              <w:spacing w:after="20" w:line="240" w:lineRule="auto"/>
+              <w:jc w:val="center"/>
+            </w:pPr>
+            <w:r/>
+            <w:r>
+              <w:rPr>
+                <w:sz w:val="16"/>
+              </w:rPr>
+              <w:t>14</w:t>
+            </w:r>
+          </w:p>
+        </w:tc>
+      </w:tr>
+      <w:tr>
+        <w:tc>
+          <w:tcPr>
+            <w:tcW w:type="dxa" w:w="1701"/>
+          </w:tcPr>
+          <w:p>
+            <w:pPr>
+              <w:spacing w:after="20" w:line="240" w:lineRule="auto"/>
+              <w:jc w:val="left"/>
+            </w:pPr>
+            <w:r/>
+            <w:r>
+              <w:rPr>
+                <w:sz w:val="16"/>
+              </w:rPr>
+              <w:t>SVM</w:t>
+            </w:r>
+          </w:p>
+        </w:tc>
+        <w:tc>
+          <w:tcPr>
+            <w:tcW w:type="dxa" w:w="6236"/>
+          </w:tcPr>
+          <w:p>
+            <w:pPr>
+              <w:spacing w:after="20" w:line="240" w:lineRule="auto"/>
+              <w:jc w:val="center"/>
+            </w:pPr>
+            <w:r/>
+            <w:r>
+              <w:rPr>
+                <w:sz w:val="16"/>
+              </w:rPr>
+              <w:t>C ∈ {0,1; 1; 10; 100}; kernel = rbf; gamma ∈ {scale, 0,01, 0,1}; reamostragem</w:t>
+            </w:r>
+          </w:p>
+        </w:tc>
+        <w:tc>
+          <w:tcPr>
+            <w:tcW w:type="dxa" w:w="1134"/>
+          </w:tcPr>
+          <w:p>
+            <w:pPr>
+              <w:spacing w:after="20" w:line="240" w:lineRule="auto"/>
+              <w:jc w:val="center"/>
+            </w:pPr>
+            <w:r/>
+            <w:r>
+              <w:rPr>
+                <w:sz w:val="16"/>
+              </w:rPr>
+              <w:t>24</w:t>
             </w:r>
           </w:p>
         </w:tc>
@@ -19216,7 +21537,7 @@
           <w:i/>
           <w:sz w:val="19"/>
         </w:rPr>
-        <w:t>Tabela 16 – Hiperparâmetros selecionados por validação cruzada.</w:t>
+        <w:t>Tabela 18 – Hiperparâmetros selecionados por validação cruzada.</w:t>
       </w:r>
     </w:p>
     <w:tbl>
@@ -19426,7 +21747,7 @@
               <w:rPr>
                 <w:sz w:val="16"/>
               </w:rPr>
-              <w:t>Regressão Logística</w:t>
+              <w:t>K-Means (classificador)</w:t>
             </w:r>
           </w:p>
         </w:tc>
@@ -19444,7 +21765,7 @@
               <w:rPr>
                 <w:sz w:val="16"/>
               </w:rPr>
-              <w:t>C=10</w:t>
+              <w:t>n_clusters=64</w:t>
             </w:r>
           </w:p>
         </w:tc>
@@ -19483,7 +21804,7 @@
               <w:rPr>
                 <w:sz w:val="16"/>
               </w:rPr>
-              <w:t>Naive Bayes</w:t>
+              <w:t>Regressão Logística</w:t>
             </w:r>
           </w:p>
         </w:tc>
@@ -19502,7 +21823,7 @@
               <w:rPr>
                 <w:sz w:val="16"/>
               </w:rPr>
-              <w:t>var_smoothing=0.1</w:t>
+              <w:t>C=10</w:t>
             </w:r>
           </w:p>
         </w:tc>
@@ -19541,6 +21862,63 @@
               <w:rPr>
                 <w:sz w:val="16"/>
               </w:rPr>
+              <w:t>Naive Bayes</w:t>
+            </w:r>
+          </w:p>
+        </w:tc>
+        <w:tc>
+          <w:tcPr>
+            <w:tcW w:type="dxa" w:w="5669"/>
+          </w:tcPr>
+          <w:p>
+            <w:pPr>
+              <w:spacing w:after="20" w:line="240" w:lineRule="auto"/>
+              <w:jc w:val="center"/>
+            </w:pPr>
+            <w:r/>
+            <w:r>
+              <w:rPr>
+                <w:sz w:val="16"/>
+              </w:rPr>
+              <w:t>var_smoothing=0.1</w:t>
+            </w:r>
+          </w:p>
+        </w:tc>
+        <w:tc>
+          <w:tcPr>
+            <w:tcW w:type="dxa" w:w="1701"/>
+          </w:tcPr>
+          <w:p>
+            <w:pPr>
+              <w:spacing w:after="20" w:line="240" w:lineRule="auto"/>
+              <w:jc w:val="center"/>
+            </w:pPr>
+            <w:r/>
+            <w:r>
+              <w:rPr>
+                <w:sz w:val="16"/>
+              </w:rPr>
+              <w:t>nenhuma</w:t>
+            </w:r>
+          </w:p>
+        </w:tc>
+      </w:tr>
+      <w:tr>
+        <w:tc>
+          <w:tcPr>
+            <w:tcW w:type="dxa" w:w="1701"/>
+            <w:shd w:val="clear" w:color="auto" w:fill="F2F2F2"/>
+          </w:tcPr>
+          <w:p>
+            <w:pPr>
+              <w:spacing w:after="20" w:line="240" w:lineRule="auto"/>
+              <w:jc w:val="left"/>
+            </w:pPr>
+            <w:r/>
+            <w:r>
+              <w:rPr>
+                <w:sz w:val="16"/>
+              </w:rPr>
               <w:t>MLP</w:t>
             </w:r>
           </w:p>
@@ -19548,6 +21926,7 @@
         <w:tc>
           <w:tcPr>
             <w:tcW w:type="dxa" w:w="5669"/>
+            <w:shd w:val="clear" w:color="auto" w:fill="F2F2F2"/>
           </w:tcPr>
           <w:p>
             <w:pPr>
@@ -19566,6 +21945,7 @@
         <w:tc>
           <w:tcPr>
             <w:tcW w:type="dxa" w:w="1701"/>
+            <w:shd w:val="clear" w:color="auto" w:fill="F2F2F2"/>
           </w:tcPr>
           <w:p>
             <w:pPr>
@@ -19578,6 +21958,62 @@
                 <w:sz w:val="16"/>
               </w:rPr>
               <w:t>SMOTE</w:t>
+            </w:r>
+          </w:p>
+        </w:tc>
+      </w:tr>
+      <w:tr>
+        <w:tc>
+          <w:tcPr>
+            <w:tcW w:type="dxa" w:w="1701"/>
+          </w:tcPr>
+          <w:p>
+            <w:pPr>
+              <w:spacing w:after="20" w:line="240" w:lineRule="auto"/>
+              <w:jc w:val="left"/>
+            </w:pPr>
+            <w:r/>
+            <w:r>
+              <w:rPr>
+                <w:sz w:val="16"/>
+              </w:rPr>
+              <w:t>SVM</w:t>
+            </w:r>
+          </w:p>
+        </w:tc>
+        <w:tc>
+          <w:tcPr>
+            <w:tcW w:type="dxa" w:w="5669"/>
+          </w:tcPr>
+          <w:p>
+            <w:pPr>
+              <w:spacing w:after="20" w:line="240" w:lineRule="auto"/>
+              <w:jc w:val="center"/>
+            </w:pPr>
+            <w:r/>
+            <w:r>
+              <w:rPr>
+                <w:sz w:val="16"/>
+              </w:rPr>
+              <w:t>C=100; gamma=0.1; kernel=rbf</w:t>
+            </w:r>
+          </w:p>
+        </w:tc>
+        <w:tc>
+          <w:tcPr>
+            <w:tcW w:type="dxa" w:w="1701"/>
+          </w:tcPr>
+          <w:p>
+            <w:pPr>
+              <w:spacing w:after="20" w:line="240" w:lineRule="auto"/>
+              <w:jc w:val="center"/>
+            </w:pPr>
+            <w:r/>
+            <w:r>
+              <w:rPr>
+                <w:sz w:val="16"/>
+              </w:rPr>
+              <w:t>nenhuma</w:t>
             </w:r>
           </w:p>
         </w:tc>
@@ -19990,7 +22426,7 @@
         <w:rPr>
           <w:b w:val="0"/>
         </w:rPr>
-        <w:t xml:space="preserve"> – afinação, avaliação e comparação dos dez modelos; importâncias e verificações de robustez.</w:t>
+        <w:t xml:space="preserve"> – afinação, avaliação e comparação dos doze modelos; importâncias e verificações de robustez.</w:t>
       </w:r>
     </w:p>
     <w:p>
@@ -20027,6 +22463,30 @@
           <w:b w:val="0"/>
         </w:rPr>
         <w:t xml:space="preserve"> – verificação de sobreajuste.</w:t>
+      </w:r>
+    </w:p>
+    <w:p>
+      <w:pPr>
+        <w:pStyle w:val="ListBullet"/>
+        <w:spacing w:after="40"/>
+        <w:jc w:val="both"/>
+      </w:pPr>
+      <w:r>
+        <w:rPr>
+          <w:b w:val="0"/>
+        </w:rPr>
+      </w:r>
+      <w:r>
+        <w:rPr>
+          <w:b/>
+        </w:rPr>
+        <w:t>notebooks/</w:t>
+      </w:r>
+      <w:r>
+        <w:rPr>
+          <w:b w:val="0"/>
+        </w:rPr>
+        <w:t xml:space="preserve"> – notebooks AATD – DT, kNN, NB, SVM, K-Means e PreProc, no molde dos das aulas e aplicados aos dados do projeto (gerados por make_notebooks.py e make_preproc_notebook.py).</w:t>
       </w:r>
     </w:p>
     <w:p>

</xml_diff>